<commit_message>
docs(recette): cahier v1.5 et guides v1.2 — circuit transporteurs, badge numerote, dates des documents obligatoires, pieces par type, conseiller de l'assistant
</commit_message>
<xml_diff>
--- a/docs/recette/guides-utilisateurs/Guide-de-test-Administrateur-CIT.docx
+++ b/docs/recette/guides-utilisateurs/Guide-de-test-Administrateur-CIT.docx
@@ -57,7 +57,7 @@
           <w:sz w:val="22"/>
           <w:szCs w:val="22"/>
         </w:rPr>
-        <w:t xml:space="preserve">Version 1.1 — 28/09/2026</w:t>
+        <w:t xml:space="preserve">Version 1.2 — 03/10/2026</w:t>
       </w:r>
     </w:p>
     <w:tbl>
@@ -171,7 +171,7 @@
           <w:b/>
           <w:bCs/>
         </w:rPr>
-        <w:t xml:space="preserve">Durée estimée : environ 60 minutes, en 9 parties.</w:t>
+        <w:t xml:space="preserve">Durée estimée : environ 60 minutes, en 11 parties.</w:t>
       </w:r>
     </w:p>
     <w:p>
@@ -3351,7 +3351,1093 @@
         <w:pStyle w:val="Heading1"/>
       </w:pPr>
       <w:r>
-        <w:t xml:space="preserve">Partie 4 — Créer le compte d'un agent</w:t>
+        <w:t xml:space="preserve">Partie 4 — Valider une entreprise de transport</w:t>
+      </w:r>
+    </w:p>
+    <w:p>
+      <w:pPr>
+        <w:spacing w:after="120"/>
+        <w:rPr>
+          <w:i/>
+          <w:iCs/>
+        </w:rPr>
+      </w:pPr>
+      <w:r>
+        <w:rPr>
+          <w:i/>
+          <w:iCs/>
+        </w:rPr>
+        <w:t xml:space="preserve">Une entreprise de transport a demandé un compte.</w:t>
+      </w:r>
+    </w:p>
+    <w:tbl>
+      <w:tblPr>
+        <w:tblW w:type="dxa" w:w="9906"/>
+        <w:tblBorders>
+          <w:top w:val="single" w:color="auto" w:sz="4"/>
+          <w:left w:val="single" w:color="auto" w:sz="4"/>
+          <w:bottom w:val="single" w:color="auto" w:sz="4"/>
+          <w:right w:val="single" w:color="auto" w:sz="4"/>
+          <w:insideH w:val="single" w:color="auto" w:sz="4"/>
+          <w:insideV w:val="single" w:color="auto" w:sz="4"/>
+        </w:tblBorders>
+      </w:tblPr>
+      <w:tblGrid>
+        <w:gridCol w:w="480"/>
+        <w:gridCol w:w="3300"/>
+        <w:gridCol w:w="2800"/>
+        <w:gridCol w:w="1800"/>
+        <w:gridCol w:w="1526"/>
+      </w:tblGrid>
+      <w:tr>
+        <w:trPr>
+          <w:tblHeader/>
+        </w:trPr>
+        <w:tc>
+          <w:tcPr>
+            <w:tcW w:type="dxa" w:w="480"/>
+            <w:tcBorders>
+              <w:top w:val="single" w:color="B8C4D0" w:sz="4"/>
+              <w:left w:val="single" w:color="B8C4D0" w:sz="4"/>
+              <w:bottom w:val="single" w:color="B8C4D0" w:sz="4"/>
+              <w:right w:val="single" w:color="B8C4D0" w:sz="4"/>
+            </w:tcBorders>
+            <w:shd w:fill="0B3D6E" w:color="auto" w:val="clear"/>
+            <w:tcMar>
+              <w:top w:type="dxa" w:w="80"/>
+              <w:left w:type="dxa" w:w="100"/>
+              <w:bottom w:type="dxa" w:w="80"/>
+              <w:right w:type="dxa" w:w="100"/>
+            </w:tcMar>
+          </w:tcPr>
+          <w:p>
+            <w:r>
+              <w:rPr>
+                <w:b/>
+                <w:bCs/>
+                <w:color w:val="FFFFFF"/>
+                <w:sz w:val="20"/>
+                <w:szCs w:val="20"/>
+              </w:rPr>
+              <w:t xml:space="preserve">N°</w:t>
+            </w:r>
+          </w:p>
+        </w:tc>
+        <w:tc>
+          <w:tcPr>
+            <w:tcW w:type="dxa" w:w="3300"/>
+            <w:tcBorders>
+              <w:top w:val="single" w:color="B8C4D0" w:sz="4"/>
+              <w:left w:val="single" w:color="B8C4D0" w:sz="4"/>
+              <w:bottom w:val="single" w:color="B8C4D0" w:sz="4"/>
+              <w:right w:val="single" w:color="B8C4D0" w:sz="4"/>
+            </w:tcBorders>
+            <w:shd w:fill="0B3D6E" w:color="auto" w:val="clear"/>
+            <w:tcMar>
+              <w:top w:type="dxa" w:w="80"/>
+              <w:left w:type="dxa" w:w="100"/>
+              <w:bottom w:type="dxa" w:w="80"/>
+              <w:right w:type="dxa" w:w="100"/>
+            </w:tcMar>
+          </w:tcPr>
+          <w:p>
+            <w:r>
+              <w:rPr>
+                <w:b/>
+                <w:bCs/>
+                <w:color w:val="FFFFFF"/>
+                <w:sz w:val="20"/>
+                <w:szCs w:val="20"/>
+              </w:rPr>
+              <w:t xml:space="preserve">Ce que vous faites</w:t>
+            </w:r>
+          </w:p>
+        </w:tc>
+        <w:tc>
+          <w:tcPr>
+            <w:tcW w:type="dxa" w:w="2800"/>
+            <w:tcBorders>
+              <w:top w:val="single" w:color="B8C4D0" w:sz="4"/>
+              <w:left w:val="single" w:color="B8C4D0" w:sz="4"/>
+              <w:bottom w:val="single" w:color="B8C4D0" w:sz="4"/>
+              <w:right w:val="single" w:color="B8C4D0" w:sz="4"/>
+            </w:tcBorders>
+            <w:shd w:fill="0B3D6E" w:color="auto" w:val="clear"/>
+            <w:tcMar>
+              <w:top w:type="dxa" w:w="80"/>
+              <w:left w:type="dxa" w:w="100"/>
+              <w:bottom w:type="dxa" w:w="80"/>
+              <w:right w:type="dxa" w:w="100"/>
+            </w:tcMar>
+          </w:tcPr>
+          <w:p>
+            <w:r>
+              <w:rPr>
+                <w:b/>
+                <w:bCs/>
+                <w:color w:val="FFFFFF"/>
+                <w:sz w:val="20"/>
+                <w:szCs w:val="20"/>
+              </w:rPr>
+              <w:t xml:space="preserve">Ce que vous devez voir</w:t>
+            </w:r>
+          </w:p>
+        </w:tc>
+        <w:tc>
+          <w:tcPr>
+            <w:tcW w:type="dxa" w:w="1800"/>
+            <w:tcBorders>
+              <w:top w:val="single" w:color="B8C4D0" w:sz="4"/>
+              <w:left w:val="single" w:color="B8C4D0" w:sz="4"/>
+              <w:bottom w:val="single" w:color="B8C4D0" w:sz="4"/>
+              <w:right w:val="single" w:color="B8C4D0" w:sz="4"/>
+            </w:tcBorders>
+            <w:shd w:fill="0B3D6E" w:color="auto" w:val="clear"/>
+            <w:tcMar>
+              <w:top w:type="dxa" w:w="80"/>
+              <w:left w:type="dxa" w:w="100"/>
+              <w:bottom w:type="dxa" w:w="80"/>
+              <w:right w:type="dxa" w:w="100"/>
+            </w:tcMar>
+          </w:tcPr>
+          <w:p>
+            <w:r>
+              <w:rPr>
+                <w:b/>
+                <w:bCs/>
+                <w:color w:val="FFFFFF"/>
+                <w:sz w:val="20"/>
+                <w:szCs w:val="20"/>
+              </w:rPr>
+              <w:t xml:space="preserve">Résultat</w:t>
+            </w:r>
+          </w:p>
+        </w:tc>
+        <w:tc>
+          <w:tcPr>
+            <w:tcW w:type="dxa" w:w="1526"/>
+            <w:tcBorders>
+              <w:top w:val="single" w:color="B8C4D0" w:sz="4"/>
+              <w:left w:val="single" w:color="B8C4D0" w:sz="4"/>
+              <w:bottom w:val="single" w:color="B8C4D0" w:sz="4"/>
+              <w:right w:val="single" w:color="B8C4D0" w:sz="4"/>
+            </w:tcBorders>
+            <w:shd w:fill="0B3D6E" w:color="auto" w:val="clear"/>
+            <w:tcMar>
+              <w:top w:type="dxa" w:w="80"/>
+              <w:left w:type="dxa" w:w="100"/>
+              <w:bottom w:type="dxa" w:w="80"/>
+              <w:right w:type="dxa" w:w="100"/>
+            </w:tcMar>
+          </w:tcPr>
+          <w:p>
+            <w:r>
+              <w:rPr>
+                <w:b/>
+                <w:bCs/>
+                <w:color w:val="FFFFFF"/>
+                <w:sz w:val="20"/>
+                <w:szCs w:val="20"/>
+              </w:rPr>
+              <w:t xml:space="preserve">Commentaire</w:t>
+            </w:r>
+          </w:p>
+        </w:tc>
+      </w:tr>
+      <w:tr>
+        <w:trPr>
+          <w:cantSplit/>
+        </w:trPr>
+        <w:tc>
+          <w:tcPr>
+            <w:tcW w:type="dxa" w:w="480"/>
+            <w:tcBorders>
+              <w:top w:val="single" w:color="B8C4D0" w:sz="4"/>
+              <w:left w:val="single" w:color="B8C4D0" w:sz="4"/>
+              <w:bottom w:val="single" w:color="B8C4D0" w:sz="4"/>
+              <w:right w:val="single" w:color="B8C4D0" w:sz="4"/>
+            </w:tcBorders>
+            <w:shd w:fill="EAF1F8" w:color="auto" w:val="clear"/>
+            <w:tcMar>
+              <w:top w:type="dxa" w:w="80"/>
+              <w:left w:type="dxa" w:w="100"/>
+              <w:bottom w:type="dxa" w:w="80"/>
+              <w:right w:type="dxa" w:w="100"/>
+            </w:tcMar>
+          </w:tcPr>
+          <w:p>
+            <w:r>
+              <w:rPr>
+                <w:b w:val="false"/>
+                <w:bCs w:val="false"/>
+                <w:sz w:val="20"/>
+                <w:szCs w:val="20"/>
+              </w:rPr>
+              <w:t xml:space="preserve">1</w:t>
+            </w:r>
+          </w:p>
+        </w:tc>
+        <w:tc>
+          <w:tcPr>
+            <w:tcW w:type="dxa" w:w="3300"/>
+            <w:tcBorders>
+              <w:top w:val="single" w:color="B8C4D0" w:sz="4"/>
+              <w:left w:val="single" w:color="B8C4D0" w:sz="4"/>
+              <w:bottom w:val="single" w:color="B8C4D0" w:sz="4"/>
+              <w:right w:val="single" w:color="B8C4D0" w:sz="4"/>
+            </w:tcBorders>
+            <w:tcMar>
+              <w:top w:type="dxa" w:w="80"/>
+              <w:left w:type="dxa" w:w="100"/>
+              <w:bottom w:type="dxa" w:w="80"/>
+              <w:right w:type="dxa" w:w="100"/>
+            </w:tcMar>
+          </w:tcPr>
+          <w:p>
+            <w:r>
+              <w:rPr>
+                <w:b w:val="false"/>
+                <w:bCs w:val="false"/>
+                <w:sz w:val="20"/>
+                <w:szCs w:val="20"/>
+              </w:rPr>
+              <w:t xml:space="preserve">Dans « Demandes de compte », ouvrez la demande de profil « Transporteur » indiquée et regardez l'agrément de transport.</w:t>
+            </w:r>
+          </w:p>
+        </w:tc>
+        <w:tc>
+          <w:tcPr>
+            <w:tcW w:type="dxa" w:w="2800"/>
+            <w:tcBorders>
+              <w:top w:val="single" w:color="B8C4D0" w:sz="4"/>
+              <w:left w:val="single" w:color="B8C4D0" w:sz="4"/>
+              <w:bottom w:val="single" w:color="B8C4D0" w:sz="4"/>
+              <w:right w:val="single" w:color="B8C4D0" w:sz="4"/>
+            </w:tcBorders>
+            <w:tcMar>
+              <w:top w:type="dxa" w:w="80"/>
+              <w:left w:type="dxa" w:w="100"/>
+              <w:bottom w:type="dxa" w:w="80"/>
+              <w:right w:type="dxa" w:w="100"/>
+            </w:tcMar>
+          </w:tcPr>
+          <w:p>
+            <w:r>
+              <w:rPr>
+                <w:b w:val="false"/>
+                <w:bCs w:val="false"/>
+                <w:sz w:val="20"/>
+                <w:szCs w:val="20"/>
+              </w:rPr>
+              <w:t xml:space="preserve">Le document s'affiche dans YABA.</w:t>
+            </w:r>
+          </w:p>
+        </w:tc>
+        <w:tc>
+          <w:tcPr>
+            <w:tcW w:type="dxa" w:w="1800"/>
+            <w:tcBorders>
+              <w:top w:val="single" w:color="B8C4D0" w:sz="4"/>
+              <w:left w:val="single" w:color="B8C4D0" w:sz="4"/>
+              <w:bottom w:val="single" w:color="B8C4D0" w:sz="4"/>
+              <w:right w:val="single" w:color="B8C4D0" w:sz="4"/>
+            </w:tcBorders>
+            <w:tcMar>
+              <w:top w:type="dxa" w:w="80"/>
+              <w:left w:type="dxa" w:w="100"/>
+              <w:bottom w:type="dxa" w:w="80"/>
+              <w:right w:type="dxa" w:w="100"/>
+            </w:tcMar>
+          </w:tcPr>
+          <w:p>
+            <w:r>
+              <w:rPr>
+                <w:b w:val="false"/>
+                <w:bCs w:val="false"/>
+                <w:sz w:val="20"/>
+                <w:szCs w:val="20"/>
+              </w:rPr>
+              <w:t xml:space="preserve">☐ Ça marche</w:t>
+            </w:r>
+          </w:p>
+          <w:p>
+            <w:r>
+              <w:rPr>
+                <w:b w:val="false"/>
+                <w:bCs w:val="false"/>
+                <w:sz w:val="20"/>
+                <w:szCs w:val="20"/>
+              </w:rPr>
+              <w:t xml:space="preserve">☐ Ne marche pas</w:t>
+            </w:r>
+          </w:p>
+          <w:p>
+            <w:r>
+              <w:rPr>
+                <w:b w:val="false"/>
+                <w:bCs w:val="false"/>
+                <w:sz w:val="20"/>
+                <w:szCs w:val="20"/>
+              </w:rPr>
+              <w:t xml:space="preserve">☐ Pas compris</w:t>
+            </w:r>
+          </w:p>
+        </w:tc>
+        <w:tc>
+          <w:tcPr>
+            <w:tcW w:type="dxa" w:w="1526"/>
+            <w:tcBorders>
+              <w:top w:val="single" w:color="B8C4D0" w:sz="4"/>
+              <w:left w:val="single" w:color="B8C4D0" w:sz="4"/>
+              <w:bottom w:val="single" w:color="B8C4D0" w:sz="4"/>
+              <w:right w:val="single" w:color="B8C4D0" w:sz="4"/>
+            </w:tcBorders>
+            <w:tcMar>
+              <w:top w:type="dxa" w:w="80"/>
+              <w:left w:type="dxa" w:w="100"/>
+              <w:bottom w:type="dxa" w:w="80"/>
+              <w:right w:type="dxa" w:w="100"/>
+            </w:tcMar>
+          </w:tcPr>
+          <w:p>
+            <w:r>
+              <w:rPr>
+                <w:b w:val="false"/>
+                <w:bCs w:val="false"/>
+                <w:sz w:val="20"/>
+                <w:szCs w:val="20"/>
+              </w:rPr>
+              <w:t xml:space="preserve"/>
+            </w:r>
+          </w:p>
+        </w:tc>
+      </w:tr>
+      <w:tr>
+        <w:trPr>
+          <w:cantSplit/>
+        </w:trPr>
+        <w:tc>
+          <w:tcPr>
+            <w:tcW w:type="dxa" w:w="480"/>
+            <w:tcBorders>
+              <w:top w:val="single" w:color="B8C4D0" w:sz="4"/>
+              <w:left w:val="single" w:color="B8C4D0" w:sz="4"/>
+              <w:bottom w:val="single" w:color="B8C4D0" w:sz="4"/>
+              <w:right w:val="single" w:color="B8C4D0" w:sz="4"/>
+            </w:tcBorders>
+            <w:shd w:fill="EAF1F8" w:color="auto" w:val="clear"/>
+            <w:tcMar>
+              <w:top w:type="dxa" w:w="80"/>
+              <w:left w:type="dxa" w:w="100"/>
+              <w:bottom w:type="dxa" w:w="80"/>
+              <w:right w:type="dxa" w:w="100"/>
+            </w:tcMar>
+          </w:tcPr>
+          <w:p>
+            <w:r>
+              <w:rPr>
+                <w:b w:val="false"/>
+                <w:bCs w:val="false"/>
+                <w:sz w:val="20"/>
+                <w:szCs w:val="20"/>
+              </w:rPr>
+              <w:t xml:space="preserve">2</w:t>
+            </w:r>
+          </w:p>
+        </w:tc>
+        <w:tc>
+          <w:tcPr>
+            <w:tcW w:type="dxa" w:w="3300"/>
+            <w:tcBorders>
+              <w:top w:val="single" w:color="B8C4D0" w:sz="4"/>
+              <w:left w:val="single" w:color="B8C4D0" w:sz="4"/>
+              <w:bottom w:val="single" w:color="B8C4D0" w:sz="4"/>
+              <w:right w:val="single" w:color="B8C4D0" w:sz="4"/>
+            </w:tcBorders>
+            <w:tcMar>
+              <w:top w:type="dxa" w:w="80"/>
+              <w:left w:type="dxa" w:w="100"/>
+              <w:bottom w:type="dxa" w:w="80"/>
+              <w:right w:type="dxa" w:w="100"/>
+            </w:tcMar>
+          </w:tcPr>
+          <w:p>
+            <w:r>
+              <w:rPr>
+                <w:b w:val="false"/>
+                <w:bCs w:val="false"/>
+                <w:sz w:val="20"/>
+                <w:szCs w:val="20"/>
+              </w:rPr>
+              <w:t xml:space="preserve">Cliquez sur « Valider ».</w:t>
+            </w:r>
+          </w:p>
+        </w:tc>
+        <w:tc>
+          <w:tcPr>
+            <w:tcW w:type="dxa" w:w="2800"/>
+            <w:tcBorders>
+              <w:top w:val="single" w:color="B8C4D0" w:sz="4"/>
+              <w:left w:val="single" w:color="B8C4D0" w:sz="4"/>
+              <w:bottom w:val="single" w:color="B8C4D0" w:sz="4"/>
+              <w:right w:val="single" w:color="B8C4D0" w:sz="4"/>
+            </w:tcBorders>
+            <w:tcMar>
+              <w:top w:type="dxa" w:w="80"/>
+              <w:left w:type="dxa" w:w="100"/>
+              <w:bottom w:type="dxa" w:w="80"/>
+              <w:right w:type="dxa" w:w="100"/>
+            </w:tcMar>
+          </w:tcPr>
+          <w:p>
+            <w:r>
+              <w:rPr>
+                <w:b w:val="false"/>
+                <w:bCs w:val="false"/>
+                <w:sz w:val="20"/>
+                <w:szCs w:val="20"/>
+              </w:rPr>
+              <w:t xml:space="preserve">L'entreprise est créée avec le type « Transporteur ». Le demandeur reçoit l'e-mail « compte activé ».</w:t>
+            </w:r>
+          </w:p>
+        </w:tc>
+        <w:tc>
+          <w:tcPr>
+            <w:tcW w:type="dxa" w:w="1800"/>
+            <w:tcBorders>
+              <w:top w:val="single" w:color="B8C4D0" w:sz="4"/>
+              <w:left w:val="single" w:color="B8C4D0" w:sz="4"/>
+              <w:bottom w:val="single" w:color="B8C4D0" w:sz="4"/>
+              <w:right w:val="single" w:color="B8C4D0" w:sz="4"/>
+            </w:tcBorders>
+            <w:tcMar>
+              <w:top w:type="dxa" w:w="80"/>
+              <w:left w:type="dxa" w:w="100"/>
+              <w:bottom w:type="dxa" w:w="80"/>
+              <w:right w:type="dxa" w:w="100"/>
+            </w:tcMar>
+          </w:tcPr>
+          <w:p>
+            <w:r>
+              <w:rPr>
+                <w:b w:val="false"/>
+                <w:bCs w:val="false"/>
+                <w:sz w:val="20"/>
+                <w:szCs w:val="20"/>
+              </w:rPr>
+              <w:t xml:space="preserve">☐ Ça marche</w:t>
+            </w:r>
+          </w:p>
+          <w:p>
+            <w:r>
+              <w:rPr>
+                <w:b w:val="false"/>
+                <w:bCs w:val="false"/>
+                <w:sz w:val="20"/>
+                <w:szCs w:val="20"/>
+              </w:rPr>
+              <w:t xml:space="preserve">☐ Ne marche pas</w:t>
+            </w:r>
+          </w:p>
+          <w:p>
+            <w:r>
+              <w:rPr>
+                <w:b w:val="false"/>
+                <w:bCs w:val="false"/>
+                <w:sz w:val="20"/>
+                <w:szCs w:val="20"/>
+              </w:rPr>
+              <w:t xml:space="preserve">☐ Pas compris</w:t>
+            </w:r>
+          </w:p>
+        </w:tc>
+        <w:tc>
+          <w:tcPr>
+            <w:tcW w:type="dxa" w:w="1526"/>
+            <w:tcBorders>
+              <w:top w:val="single" w:color="B8C4D0" w:sz="4"/>
+              <w:left w:val="single" w:color="B8C4D0" w:sz="4"/>
+              <w:bottom w:val="single" w:color="B8C4D0" w:sz="4"/>
+              <w:right w:val="single" w:color="B8C4D0" w:sz="4"/>
+            </w:tcBorders>
+            <w:tcMar>
+              <w:top w:type="dxa" w:w="80"/>
+              <w:left w:type="dxa" w:w="100"/>
+              <w:bottom w:type="dxa" w:w="80"/>
+              <w:right w:type="dxa" w:w="100"/>
+            </w:tcMar>
+          </w:tcPr>
+          <w:p>
+            <w:r>
+              <w:rPr>
+                <w:b w:val="false"/>
+                <w:bCs w:val="false"/>
+                <w:sz w:val="20"/>
+                <w:szCs w:val="20"/>
+              </w:rPr>
+              <w:t xml:space="preserve"/>
+            </w:r>
+          </w:p>
+        </w:tc>
+      </w:tr>
+    </w:tbl>
+    <w:p>
+      <w:pPr>
+        <w:spacing w:after="120"/>
+      </w:pPr>
+      <w:r>
+        <w:t xml:space="preserve"/>
+      </w:r>
+    </w:p>
+    <w:p>
+      <w:pPr>
+        <w:pStyle w:val="Heading1"/>
+      </w:pPr>
+      <w:r>
+        <w:t xml:space="preserve">Partie 5 — Réserver une pièce à un type de compte</w:t>
+      </w:r>
+    </w:p>
+    <w:p>
+      <w:pPr>
+        <w:spacing w:after="120"/>
+        <w:rPr>
+          <w:i/>
+          <w:iCs/>
+        </w:rPr>
+      </w:pPr>
+      <w:r>
+        <w:rPr>
+          <w:i/>
+          <w:iCs/>
+        </w:rPr>
+        <w:t xml:space="preserve">Vous voulez exiger un document seulement d'un type de société.</w:t>
+      </w:r>
+    </w:p>
+    <w:tbl>
+      <w:tblPr>
+        <w:tblW w:type="dxa" w:w="9906"/>
+        <w:tblBorders>
+          <w:top w:val="single" w:color="auto" w:sz="4"/>
+          <w:left w:val="single" w:color="auto" w:sz="4"/>
+          <w:bottom w:val="single" w:color="auto" w:sz="4"/>
+          <w:right w:val="single" w:color="auto" w:sz="4"/>
+          <w:insideH w:val="single" w:color="auto" w:sz="4"/>
+          <w:insideV w:val="single" w:color="auto" w:sz="4"/>
+        </w:tblBorders>
+      </w:tblPr>
+      <w:tblGrid>
+        <w:gridCol w:w="480"/>
+        <w:gridCol w:w="3300"/>
+        <w:gridCol w:w="2800"/>
+        <w:gridCol w:w="1800"/>
+        <w:gridCol w:w="1526"/>
+      </w:tblGrid>
+      <w:tr>
+        <w:trPr>
+          <w:tblHeader/>
+        </w:trPr>
+        <w:tc>
+          <w:tcPr>
+            <w:tcW w:type="dxa" w:w="480"/>
+            <w:tcBorders>
+              <w:top w:val="single" w:color="B8C4D0" w:sz="4"/>
+              <w:left w:val="single" w:color="B8C4D0" w:sz="4"/>
+              <w:bottom w:val="single" w:color="B8C4D0" w:sz="4"/>
+              <w:right w:val="single" w:color="B8C4D0" w:sz="4"/>
+            </w:tcBorders>
+            <w:shd w:fill="0B3D6E" w:color="auto" w:val="clear"/>
+            <w:tcMar>
+              <w:top w:type="dxa" w:w="80"/>
+              <w:left w:type="dxa" w:w="100"/>
+              <w:bottom w:type="dxa" w:w="80"/>
+              <w:right w:type="dxa" w:w="100"/>
+            </w:tcMar>
+          </w:tcPr>
+          <w:p>
+            <w:r>
+              <w:rPr>
+                <w:b/>
+                <w:bCs/>
+                <w:color w:val="FFFFFF"/>
+                <w:sz w:val="20"/>
+                <w:szCs w:val="20"/>
+              </w:rPr>
+              <w:t xml:space="preserve">N°</w:t>
+            </w:r>
+          </w:p>
+        </w:tc>
+        <w:tc>
+          <w:tcPr>
+            <w:tcW w:type="dxa" w:w="3300"/>
+            <w:tcBorders>
+              <w:top w:val="single" w:color="B8C4D0" w:sz="4"/>
+              <w:left w:val="single" w:color="B8C4D0" w:sz="4"/>
+              <w:bottom w:val="single" w:color="B8C4D0" w:sz="4"/>
+              <w:right w:val="single" w:color="B8C4D0" w:sz="4"/>
+            </w:tcBorders>
+            <w:shd w:fill="0B3D6E" w:color="auto" w:val="clear"/>
+            <w:tcMar>
+              <w:top w:type="dxa" w:w="80"/>
+              <w:left w:type="dxa" w:w="100"/>
+              <w:bottom w:type="dxa" w:w="80"/>
+              <w:right w:type="dxa" w:w="100"/>
+            </w:tcMar>
+          </w:tcPr>
+          <w:p>
+            <w:r>
+              <w:rPr>
+                <w:b/>
+                <w:bCs/>
+                <w:color w:val="FFFFFF"/>
+                <w:sz w:val="20"/>
+                <w:szCs w:val="20"/>
+              </w:rPr>
+              <w:t xml:space="preserve">Ce que vous faites</w:t>
+            </w:r>
+          </w:p>
+        </w:tc>
+        <w:tc>
+          <w:tcPr>
+            <w:tcW w:type="dxa" w:w="2800"/>
+            <w:tcBorders>
+              <w:top w:val="single" w:color="B8C4D0" w:sz="4"/>
+              <w:left w:val="single" w:color="B8C4D0" w:sz="4"/>
+              <w:bottom w:val="single" w:color="B8C4D0" w:sz="4"/>
+              <w:right w:val="single" w:color="B8C4D0" w:sz="4"/>
+            </w:tcBorders>
+            <w:shd w:fill="0B3D6E" w:color="auto" w:val="clear"/>
+            <w:tcMar>
+              <w:top w:type="dxa" w:w="80"/>
+              <w:left w:type="dxa" w:w="100"/>
+              <w:bottom w:type="dxa" w:w="80"/>
+              <w:right w:type="dxa" w:w="100"/>
+            </w:tcMar>
+          </w:tcPr>
+          <w:p>
+            <w:r>
+              <w:rPr>
+                <w:b/>
+                <w:bCs/>
+                <w:color w:val="FFFFFF"/>
+                <w:sz w:val="20"/>
+                <w:szCs w:val="20"/>
+              </w:rPr>
+              <w:t xml:space="preserve">Ce que vous devez voir</w:t>
+            </w:r>
+          </w:p>
+        </w:tc>
+        <w:tc>
+          <w:tcPr>
+            <w:tcW w:type="dxa" w:w="1800"/>
+            <w:tcBorders>
+              <w:top w:val="single" w:color="B8C4D0" w:sz="4"/>
+              <w:left w:val="single" w:color="B8C4D0" w:sz="4"/>
+              <w:bottom w:val="single" w:color="B8C4D0" w:sz="4"/>
+              <w:right w:val="single" w:color="B8C4D0" w:sz="4"/>
+            </w:tcBorders>
+            <w:shd w:fill="0B3D6E" w:color="auto" w:val="clear"/>
+            <w:tcMar>
+              <w:top w:type="dxa" w:w="80"/>
+              <w:left w:type="dxa" w:w="100"/>
+              <w:bottom w:type="dxa" w:w="80"/>
+              <w:right w:type="dxa" w:w="100"/>
+            </w:tcMar>
+          </w:tcPr>
+          <w:p>
+            <w:r>
+              <w:rPr>
+                <w:b/>
+                <w:bCs/>
+                <w:color w:val="FFFFFF"/>
+                <w:sz w:val="20"/>
+                <w:szCs w:val="20"/>
+              </w:rPr>
+              <w:t xml:space="preserve">Résultat</w:t>
+            </w:r>
+          </w:p>
+        </w:tc>
+        <w:tc>
+          <w:tcPr>
+            <w:tcW w:type="dxa" w:w="1526"/>
+            <w:tcBorders>
+              <w:top w:val="single" w:color="B8C4D0" w:sz="4"/>
+              <w:left w:val="single" w:color="B8C4D0" w:sz="4"/>
+              <w:bottom w:val="single" w:color="B8C4D0" w:sz="4"/>
+              <w:right w:val="single" w:color="B8C4D0" w:sz="4"/>
+            </w:tcBorders>
+            <w:shd w:fill="0B3D6E" w:color="auto" w:val="clear"/>
+            <w:tcMar>
+              <w:top w:type="dxa" w:w="80"/>
+              <w:left w:type="dxa" w:w="100"/>
+              <w:bottom w:type="dxa" w:w="80"/>
+              <w:right w:type="dxa" w:w="100"/>
+            </w:tcMar>
+          </w:tcPr>
+          <w:p>
+            <w:r>
+              <w:rPr>
+                <w:b/>
+                <w:bCs/>
+                <w:color w:val="FFFFFF"/>
+                <w:sz w:val="20"/>
+                <w:szCs w:val="20"/>
+              </w:rPr>
+              <w:t xml:space="preserve">Commentaire</w:t>
+            </w:r>
+          </w:p>
+        </w:tc>
+      </w:tr>
+      <w:tr>
+        <w:trPr>
+          <w:cantSplit/>
+        </w:trPr>
+        <w:tc>
+          <w:tcPr>
+            <w:tcW w:type="dxa" w:w="480"/>
+            <w:tcBorders>
+              <w:top w:val="single" w:color="B8C4D0" w:sz="4"/>
+              <w:left w:val="single" w:color="B8C4D0" w:sz="4"/>
+              <w:bottom w:val="single" w:color="B8C4D0" w:sz="4"/>
+              <w:right w:val="single" w:color="B8C4D0" w:sz="4"/>
+            </w:tcBorders>
+            <w:shd w:fill="EAF1F8" w:color="auto" w:val="clear"/>
+            <w:tcMar>
+              <w:top w:type="dxa" w:w="80"/>
+              <w:left w:type="dxa" w:w="100"/>
+              <w:bottom w:type="dxa" w:w="80"/>
+              <w:right w:type="dxa" w:w="100"/>
+            </w:tcMar>
+          </w:tcPr>
+          <w:p>
+            <w:r>
+              <w:rPr>
+                <w:b w:val="false"/>
+                <w:bCs w:val="false"/>
+                <w:sz w:val="20"/>
+                <w:szCs w:val="20"/>
+              </w:rPr>
+              <w:t xml:space="preserve">1</w:t>
+            </w:r>
+          </w:p>
+        </w:tc>
+        <w:tc>
+          <w:tcPr>
+            <w:tcW w:type="dxa" w:w="3300"/>
+            <w:tcBorders>
+              <w:top w:val="single" w:color="B8C4D0" w:sz="4"/>
+              <w:left w:val="single" w:color="B8C4D0" w:sz="4"/>
+              <w:bottom w:val="single" w:color="B8C4D0" w:sz="4"/>
+              <w:right w:val="single" w:color="B8C4D0" w:sz="4"/>
+            </w:tcBorders>
+            <w:tcMar>
+              <w:top w:type="dxa" w:w="80"/>
+              <w:left w:type="dxa" w:w="100"/>
+              <w:bottom w:type="dxa" w:w="80"/>
+              <w:right w:type="dxa" w:w="100"/>
+            </w:tcMar>
+          </w:tcPr>
+          <w:p>
+            <w:r>
+              <w:rPr>
+                <w:b w:val="false"/>
+                <w:bCs w:val="false"/>
+                <w:sz w:val="20"/>
+                <w:szCs w:val="20"/>
+              </w:rPr>
+              <w:t xml:space="preserve">Ouvrez « Pièces exigées ». Créez une pièce, cochez « Obligatoire » et choisissez « Transporteur » dans « Type de compte ».</w:t>
+            </w:r>
+          </w:p>
+        </w:tc>
+        <w:tc>
+          <w:tcPr>
+            <w:tcW w:type="dxa" w:w="2800"/>
+            <w:tcBorders>
+              <w:top w:val="single" w:color="B8C4D0" w:sz="4"/>
+              <w:left w:val="single" w:color="B8C4D0" w:sz="4"/>
+              <w:bottom w:val="single" w:color="B8C4D0" w:sz="4"/>
+              <w:right w:val="single" w:color="B8C4D0" w:sz="4"/>
+            </w:tcBorders>
+            <w:tcMar>
+              <w:top w:type="dxa" w:w="80"/>
+              <w:left w:type="dxa" w:w="100"/>
+              <w:bottom w:type="dxa" w:w="80"/>
+              <w:right w:type="dxa" w:w="100"/>
+            </w:tcMar>
+          </w:tcPr>
+          <w:p>
+            <w:r>
+              <w:rPr>
+                <w:b w:val="false"/>
+                <w:bCs w:val="false"/>
+                <w:sz w:val="20"/>
+                <w:szCs w:val="20"/>
+              </w:rPr>
+              <w:t xml:space="preserve">La pièce apparaît dans la liste avec un badge « Transporteur ».</w:t>
+            </w:r>
+          </w:p>
+        </w:tc>
+        <w:tc>
+          <w:tcPr>
+            <w:tcW w:type="dxa" w:w="1800"/>
+            <w:tcBorders>
+              <w:top w:val="single" w:color="B8C4D0" w:sz="4"/>
+              <w:left w:val="single" w:color="B8C4D0" w:sz="4"/>
+              <w:bottom w:val="single" w:color="B8C4D0" w:sz="4"/>
+              <w:right w:val="single" w:color="B8C4D0" w:sz="4"/>
+            </w:tcBorders>
+            <w:tcMar>
+              <w:top w:type="dxa" w:w="80"/>
+              <w:left w:type="dxa" w:w="100"/>
+              <w:bottom w:type="dxa" w:w="80"/>
+              <w:right w:type="dxa" w:w="100"/>
+            </w:tcMar>
+          </w:tcPr>
+          <w:p>
+            <w:r>
+              <w:rPr>
+                <w:b w:val="false"/>
+                <w:bCs w:val="false"/>
+                <w:sz w:val="20"/>
+                <w:szCs w:val="20"/>
+              </w:rPr>
+              <w:t xml:space="preserve">☐ Ça marche</w:t>
+            </w:r>
+          </w:p>
+          <w:p>
+            <w:r>
+              <w:rPr>
+                <w:b w:val="false"/>
+                <w:bCs w:val="false"/>
+                <w:sz w:val="20"/>
+                <w:szCs w:val="20"/>
+              </w:rPr>
+              <w:t xml:space="preserve">☐ Ne marche pas</w:t>
+            </w:r>
+          </w:p>
+          <w:p>
+            <w:r>
+              <w:rPr>
+                <w:b w:val="false"/>
+                <w:bCs w:val="false"/>
+                <w:sz w:val="20"/>
+                <w:szCs w:val="20"/>
+              </w:rPr>
+              <w:t xml:space="preserve">☐ Pas compris</w:t>
+            </w:r>
+          </w:p>
+        </w:tc>
+        <w:tc>
+          <w:tcPr>
+            <w:tcW w:type="dxa" w:w="1526"/>
+            <w:tcBorders>
+              <w:top w:val="single" w:color="B8C4D0" w:sz="4"/>
+              <w:left w:val="single" w:color="B8C4D0" w:sz="4"/>
+              <w:bottom w:val="single" w:color="B8C4D0" w:sz="4"/>
+              <w:right w:val="single" w:color="B8C4D0" w:sz="4"/>
+            </w:tcBorders>
+            <w:tcMar>
+              <w:top w:type="dxa" w:w="80"/>
+              <w:left w:type="dxa" w:w="100"/>
+              <w:bottom w:type="dxa" w:w="80"/>
+              <w:right w:type="dxa" w:w="100"/>
+            </w:tcMar>
+          </w:tcPr>
+          <w:p>
+            <w:r>
+              <w:rPr>
+                <w:b w:val="false"/>
+                <w:bCs w:val="false"/>
+                <w:sz w:val="20"/>
+                <w:szCs w:val="20"/>
+              </w:rPr>
+              <w:t xml:space="preserve"/>
+            </w:r>
+          </w:p>
+        </w:tc>
+      </w:tr>
+      <w:tr>
+        <w:trPr>
+          <w:cantSplit/>
+        </w:trPr>
+        <w:tc>
+          <w:tcPr>
+            <w:tcW w:type="dxa" w:w="480"/>
+            <w:tcBorders>
+              <w:top w:val="single" w:color="B8C4D0" w:sz="4"/>
+              <w:left w:val="single" w:color="B8C4D0" w:sz="4"/>
+              <w:bottom w:val="single" w:color="B8C4D0" w:sz="4"/>
+              <w:right w:val="single" w:color="B8C4D0" w:sz="4"/>
+            </w:tcBorders>
+            <w:shd w:fill="EAF1F8" w:color="auto" w:val="clear"/>
+            <w:tcMar>
+              <w:top w:type="dxa" w:w="80"/>
+              <w:left w:type="dxa" w:w="100"/>
+              <w:bottom w:type="dxa" w:w="80"/>
+              <w:right w:type="dxa" w:w="100"/>
+            </w:tcMar>
+          </w:tcPr>
+          <w:p>
+            <w:r>
+              <w:rPr>
+                <w:b w:val="false"/>
+                <w:bCs w:val="false"/>
+                <w:sz w:val="20"/>
+                <w:szCs w:val="20"/>
+              </w:rPr>
+              <w:t xml:space="preserve">2</w:t>
+            </w:r>
+          </w:p>
+        </w:tc>
+        <w:tc>
+          <w:tcPr>
+            <w:tcW w:type="dxa" w:w="3300"/>
+            <w:tcBorders>
+              <w:top w:val="single" w:color="B8C4D0" w:sz="4"/>
+              <w:left w:val="single" w:color="B8C4D0" w:sz="4"/>
+              <w:bottom w:val="single" w:color="B8C4D0" w:sz="4"/>
+              <w:right w:val="single" w:color="B8C4D0" w:sz="4"/>
+            </w:tcBorders>
+            <w:tcMar>
+              <w:top w:type="dxa" w:w="80"/>
+              <w:left w:type="dxa" w:w="100"/>
+              <w:bottom w:type="dxa" w:w="80"/>
+              <w:right w:type="dxa" w:w="100"/>
+            </w:tcMar>
+          </w:tcPr>
+          <w:p>
+            <w:r>
+              <w:rPr>
+                <w:b w:val="false"/>
+                <w:bCs w:val="false"/>
+                <w:sz w:val="20"/>
+                <w:szCs w:val="20"/>
+              </w:rPr>
+              <w:t xml:space="preserve">Demandez à l'équipe projet d'ouvrir le formulaire de demande de compte avec un autre profil.</w:t>
+            </w:r>
+          </w:p>
+        </w:tc>
+        <w:tc>
+          <w:tcPr>
+            <w:tcW w:type="dxa" w:w="2800"/>
+            <w:tcBorders>
+              <w:top w:val="single" w:color="B8C4D0" w:sz="4"/>
+              <w:left w:val="single" w:color="B8C4D0" w:sz="4"/>
+              <w:bottom w:val="single" w:color="B8C4D0" w:sz="4"/>
+              <w:right w:val="single" w:color="B8C4D0" w:sz="4"/>
+            </w:tcBorders>
+            <w:tcMar>
+              <w:top w:type="dxa" w:w="80"/>
+              <w:left w:type="dxa" w:w="100"/>
+              <w:bottom w:type="dxa" w:w="80"/>
+              <w:right w:type="dxa" w:w="100"/>
+            </w:tcMar>
+          </w:tcPr>
+          <w:p>
+            <w:r>
+              <w:rPr>
+                <w:b w:val="false"/>
+                <w:bCs w:val="false"/>
+                <w:sz w:val="20"/>
+                <w:szCs w:val="20"/>
+              </w:rPr>
+              <w:t xml:space="preserve">La pièce n'est pas demandée. Elle n'apparaît qu'avec le profil « Transporteur ».</w:t>
+            </w:r>
+          </w:p>
+        </w:tc>
+        <w:tc>
+          <w:tcPr>
+            <w:tcW w:type="dxa" w:w="1800"/>
+            <w:tcBorders>
+              <w:top w:val="single" w:color="B8C4D0" w:sz="4"/>
+              <w:left w:val="single" w:color="B8C4D0" w:sz="4"/>
+              <w:bottom w:val="single" w:color="B8C4D0" w:sz="4"/>
+              <w:right w:val="single" w:color="B8C4D0" w:sz="4"/>
+            </w:tcBorders>
+            <w:tcMar>
+              <w:top w:type="dxa" w:w="80"/>
+              <w:left w:type="dxa" w:w="100"/>
+              <w:bottom w:type="dxa" w:w="80"/>
+              <w:right w:type="dxa" w:w="100"/>
+            </w:tcMar>
+          </w:tcPr>
+          <w:p>
+            <w:r>
+              <w:rPr>
+                <w:b w:val="false"/>
+                <w:bCs w:val="false"/>
+                <w:sz w:val="20"/>
+                <w:szCs w:val="20"/>
+              </w:rPr>
+              <w:t xml:space="preserve">☐ Ça marche</w:t>
+            </w:r>
+          </w:p>
+          <w:p>
+            <w:r>
+              <w:rPr>
+                <w:b w:val="false"/>
+                <w:bCs w:val="false"/>
+                <w:sz w:val="20"/>
+                <w:szCs w:val="20"/>
+              </w:rPr>
+              <w:t xml:space="preserve">☐ Ne marche pas</w:t>
+            </w:r>
+          </w:p>
+          <w:p>
+            <w:r>
+              <w:rPr>
+                <w:b w:val="false"/>
+                <w:bCs w:val="false"/>
+                <w:sz w:val="20"/>
+                <w:szCs w:val="20"/>
+              </w:rPr>
+              <w:t xml:space="preserve">☐ Pas compris</w:t>
+            </w:r>
+          </w:p>
+        </w:tc>
+        <w:tc>
+          <w:tcPr>
+            <w:tcW w:type="dxa" w:w="1526"/>
+            <w:tcBorders>
+              <w:top w:val="single" w:color="B8C4D0" w:sz="4"/>
+              <w:left w:val="single" w:color="B8C4D0" w:sz="4"/>
+              <w:bottom w:val="single" w:color="B8C4D0" w:sz="4"/>
+              <w:right w:val="single" w:color="B8C4D0" w:sz="4"/>
+            </w:tcBorders>
+            <w:tcMar>
+              <w:top w:type="dxa" w:w="80"/>
+              <w:left w:type="dxa" w:w="100"/>
+              <w:bottom w:type="dxa" w:w="80"/>
+              <w:right w:type="dxa" w:w="100"/>
+            </w:tcMar>
+          </w:tcPr>
+          <w:p>
+            <w:r>
+              <w:rPr>
+                <w:b w:val="false"/>
+                <w:bCs w:val="false"/>
+                <w:sz w:val="20"/>
+                <w:szCs w:val="20"/>
+              </w:rPr>
+              <w:t xml:space="preserve"/>
+            </w:r>
+          </w:p>
+        </w:tc>
+      </w:tr>
+    </w:tbl>
+    <w:p>
+      <w:pPr>
+        <w:spacing w:after="120"/>
+      </w:pPr>
+      <w:r>
+        <w:t xml:space="preserve"/>
+      </w:r>
+    </w:p>
+    <w:p>
+      <w:pPr>
+        <w:pStyle w:val="Heading1"/>
+      </w:pPr>
+      <w:r>
+        <w:t xml:space="preserve">Partie 6 — Créer le compte d'un agent</w:t>
       </w:r>
     </w:p>
     <w:p>
@@ -4062,7 +5148,7 @@
         <w:pStyle w:val="Heading1"/>
       </w:pPr>
       <w:r>
-        <w:t xml:space="preserve">Partie 5 — Débloquer un agent qui a perdu son téléphone</w:t>
+        <w:t xml:space="preserve">Partie 7 — Débloquer un agent qui a perdu son téléphone</w:t>
       </w:r>
     </w:p>
     <w:p>
@@ -4605,7 +5691,7 @@
         <w:pStyle w:val="Heading1"/>
       </w:pPr>
       <w:r>
-        <w:t xml:space="preserve">Partie 6 — Modifier les textes proposés aux utilisateurs</w:t>
+        <w:t xml:space="preserve">Partie 8 — Modifier les textes proposés aux utilisateurs</w:t>
       </w:r>
     </w:p>
     <w:p>
@@ -5148,7 +6234,7 @@
         <w:pStyle w:val="Heading1"/>
       </w:pPr>
       <w:r>
-        <w:t xml:space="preserve">Partie 7 — Modifier une fiche d'aide</w:t>
+        <w:t xml:space="preserve">Partie 9 — Modifier une fiche d'aide</w:t>
       </w:r>
     </w:p>
     <w:p>
@@ -5691,7 +6777,7 @@
         <w:pStyle w:val="Heading1"/>
       </w:pPr>
       <w:r>
-        <w:t xml:space="preserve">Partie 8 — Consulter l'historique des actions</w:t>
+        <w:t xml:space="preserve">Partie 10 — Consulter l'historique des actions</w:t>
       </w:r>
     </w:p>
     <w:p>
@@ -6066,7 +7152,7 @@
         <w:pStyle w:val="Heading1"/>
       </w:pPr>
       <w:r>
-        <w:t xml:space="preserve">Partie 9 — Terminer</w:t>
+        <w:t xml:space="preserve">Partie 11 — Terminer</w:t>
       </w:r>
     </w:p>
     <w:p>

</xml_diff>

<commit_message>
docs(recette): cahier v1.6 et guides v1.3 — revue UX de tous les roles (pieces de flotte, complement avec pieces, flotte reservee aux transporteurs, retrait par liste, relances espacees, notifications, confirmation avant depot, preuve et client dans les files, doublons, supervision, validation des comptes)
</commit_message>
<xml_diff>
--- a/docs/recette/guides-utilisateurs/Guide-de-test-Administrateur-CIT.docx
+++ b/docs/recette/guides-utilisateurs/Guide-de-test-Administrateur-CIT.docx
@@ -57,7 +57,7 @@
           <w:sz w:val="22"/>
           <w:szCs w:val="22"/>
         </w:rPr>
-        <w:t xml:space="preserve">Version 1.2 — 03/10/2026</w:t>
+        <w:t xml:space="preserve">Version 1.3 — 04/10/2026</w:t>
       </w:r>
     </w:p>
     <w:tbl>
@@ -171,7 +171,7 @@
           <w:b/>
           <w:bCs/>
         </w:rPr>
-        <w:t xml:space="preserve">Durée estimée : environ 60 minutes, en 11 parties.</w:t>
+        <w:t xml:space="preserve">Durée estimée : environ 75 minutes, en 12 parties.</w:t>
       </w:r>
     </w:p>
     <w:p>
@@ -7152,7 +7152,550 @@
         <w:pStyle w:val="Heading1"/>
       </w:pPr>
       <w:r>
-        <w:t xml:space="preserve">Partie 11 — Terminer</w:t>
+        <w:t xml:space="preserve">Partie 11 — Valider une demande de compte</w:t>
+      </w:r>
+    </w:p>
+    <w:p>
+      <w:pPr>
+        <w:spacing w:after="120"/>
+        <w:rPr>
+          <w:i/>
+          <w:iCs/>
+        </w:rPr>
+      </w:pPr>
+      <w:r>
+        <w:rPr>
+          <w:i/>
+          <w:iCs/>
+        </w:rPr>
+        <w:t xml:space="preserve">Une entreprise demande à ouvrir un compte.</w:t>
+      </w:r>
+    </w:p>
+    <w:tbl>
+      <w:tblPr>
+        <w:tblW w:type="dxa" w:w="9906"/>
+        <w:tblBorders>
+          <w:top w:val="single" w:color="auto" w:sz="4"/>
+          <w:left w:val="single" w:color="auto" w:sz="4"/>
+          <w:bottom w:val="single" w:color="auto" w:sz="4"/>
+          <w:right w:val="single" w:color="auto" w:sz="4"/>
+          <w:insideH w:val="single" w:color="auto" w:sz="4"/>
+          <w:insideV w:val="single" w:color="auto" w:sz="4"/>
+        </w:tblBorders>
+      </w:tblPr>
+      <w:tblGrid>
+        <w:gridCol w:w="480"/>
+        <w:gridCol w:w="3300"/>
+        <w:gridCol w:w="2800"/>
+        <w:gridCol w:w="1800"/>
+        <w:gridCol w:w="1526"/>
+      </w:tblGrid>
+      <w:tr>
+        <w:trPr>
+          <w:tblHeader/>
+        </w:trPr>
+        <w:tc>
+          <w:tcPr>
+            <w:tcW w:type="dxa" w:w="480"/>
+            <w:tcBorders>
+              <w:top w:val="single" w:color="B8C4D0" w:sz="4"/>
+              <w:left w:val="single" w:color="B8C4D0" w:sz="4"/>
+              <w:bottom w:val="single" w:color="B8C4D0" w:sz="4"/>
+              <w:right w:val="single" w:color="B8C4D0" w:sz="4"/>
+            </w:tcBorders>
+            <w:shd w:fill="0B3D6E" w:color="auto" w:val="clear"/>
+            <w:tcMar>
+              <w:top w:type="dxa" w:w="80"/>
+              <w:left w:type="dxa" w:w="100"/>
+              <w:bottom w:type="dxa" w:w="80"/>
+              <w:right w:type="dxa" w:w="100"/>
+            </w:tcMar>
+          </w:tcPr>
+          <w:p>
+            <w:r>
+              <w:rPr>
+                <w:b/>
+                <w:bCs/>
+                <w:color w:val="FFFFFF"/>
+                <w:sz w:val="20"/>
+                <w:szCs w:val="20"/>
+              </w:rPr>
+              <w:t xml:space="preserve">N°</w:t>
+            </w:r>
+          </w:p>
+        </w:tc>
+        <w:tc>
+          <w:tcPr>
+            <w:tcW w:type="dxa" w:w="3300"/>
+            <w:tcBorders>
+              <w:top w:val="single" w:color="B8C4D0" w:sz="4"/>
+              <w:left w:val="single" w:color="B8C4D0" w:sz="4"/>
+              <w:bottom w:val="single" w:color="B8C4D0" w:sz="4"/>
+              <w:right w:val="single" w:color="B8C4D0" w:sz="4"/>
+            </w:tcBorders>
+            <w:shd w:fill="0B3D6E" w:color="auto" w:val="clear"/>
+            <w:tcMar>
+              <w:top w:type="dxa" w:w="80"/>
+              <w:left w:type="dxa" w:w="100"/>
+              <w:bottom w:type="dxa" w:w="80"/>
+              <w:right w:type="dxa" w:w="100"/>
+            </w:tcMar>
+          </w:tcPr>
+          <w:p>
+            <w:r>
+              <w:rPr>
+                <w:b/>
+                <w:bCs/>
+                <w:color w:val="FFFFFF"/>
+                <w:sz w:val="20"/>
+                <w:szCs w:val="20"/>
+              </w:rPr>
+              <w:t xml:space="preserve">Ce que vous faites</w:t>
+            </w:r>
+          </w:p>
+        </w:tc>
+        <w:tc>
+          <w:tcPr>
+            <w:tcW w:type="dxa" w:w="2800"/>
+            <w:tcBorders>
+              <w:top w:val="single" w:color="B8C4D0" w:sz="4"/>
+              <w:left w:val="single" w:color="B8C4D0" w:sz="4"/>
+              <w:bottom w:val="single" w:color="B8C4D0" w:sz="4"/>
+              <w:right w:val="single" w:color="B8C4D0" w:sz="4"/>
+            </w:tcBorders>
+            <w:shd w:fill="0B3D6E" w:color="auto" w:val="clear"/>
+            <w:tcMar>
+              <w:top w:type="dxa" w:w="80"/>
+              <w:left w:type="dxa" w:w="100"/>
+              <w:bottom w:type="dxa" w:w="80"/>
+              <w:right w:type="dxa" w:w="100"/>
+            </w:tcMar>
+          </w:tcPr>
+          <w:p>
+            <w:r>
+              <w:rPr>
+                <w:b/>
+                <w:bCs/>
+                <w:color w:val="FFFFFF"/>
+                <w:sz w:val="20"/>
+                <w:szCs w:val="20"/>
+              </w:rPr>
+              <w:t xml:space="preserve">Ce que vous devez voir</w:t>
+            </w:r>
+          </w:p>
+        </w:tc>
+        <w:tc>
+          <w:tcPr>
+            <w:tcW w:type="dxa" w:w="1800"/>
+            <w:tcBorders>
+              <w:top w:val="single" w:color="B8C4D0" w:sz="4"/>
+              <w:left w:val="single" w:color="B8C4D0" w:sz="4"/>
+              <w:bottom w:val="single" w:color="B8C4D0" w:sz="4"/>
+              <w:right w:val="single" w:color="B8C4D0" w:sz="4"/>
+            </w:tcBorders>
+            <w:shd w:fill="0B3D6E" w:color="auto" w:val="clear"/>
+            <w:tcMar>
+              <w:top w:type="dxa" w:w="80"/>
+              <w:left w:type="dxa" w:w="100"/>
+              <w:bottom w:type="dxa" w:w="80"/>
+              <w:right w:type="dxa" w:w="100"/>
+            </w:tcMar>
+          </w:tcPr>
+          <w:p>
+            <w:r>
+              <w:rPr>
+                <w:b/>
+                <w:bCs/>
+                <w:color w:val="FFFFFF"/>
+                <w:sz w:val="20"/>
+                <w:szCs w:val="20"/>
+              </w:rPr>
+              <w:t xml:space="preserve">Résultat</w:t>
+            </w:r>
+          </w:p>
+        </w:tc>
+        <w:tc>
+          <w:tcPr>
+            <w:tcW w:type="dxa" w:w="1526"/>
+            <w:tcBorders>
+              <w:top w:val="single" w:color="B8C4D0" w:sz="4"/>
+              <w:left w:val="single" w:color="B8C4D0" w:sz="4"/>
+              <w:bottom w:val="single" w:color="B8C4D0" w:sz="4"/>
+              <w:right w:val="single" w:color="B8C4D0" w:sz="4"/>
+            </w:tcBorders>
+            <w:shd w:fill="0B3D6E" w:color="auto" w:val="clear"/>
+            <w:tcMar>
+              <w:top w:type="dxa" w:w="80"/>
+              <w:left w:type="dxa" w:w="100"/>
+              <w:bottom w:type="dxa" w:w="80"/>
+              <w:right w:type="dxa" w:w="100"/>
+            </w:tcMar>
+          </w:tcPr>
+          <w:p>
+            <w:r>
+              <w:rPr>
+                <w:b/>
+                <w:bCs/>
+                <w:color w:val="FFFFFF"/>
+                <w:sz w:val="20"/>
+                <w:szCs w:val="20"/>
+              </w:rPr>
+              <w:t xml:space="preserve">Commentaire</w:t>
+            </w:r>
+          </w:p>
+        </w:tc>
+      </w:tr>
+      <w:tr>
+        <w:trPr>
+          <w:cantSplit/>
+        </w:trPr>
+        <w:tc>
+          <w:tcPr>
+            <w:tcW w:type="dxa" w:w="480"/>
+            <w:tcBorders>
+              <w:top w:val="single" w:color="B8C4D0" w:sz="4"/>
+              <w:left w:val="single" w:color="B8C4D0" w:sz="4"/>
+              <w:bottom w:val="single" w:color="B8C4D0" w:sz="4"/>
+              <w:right w:val="single" w:color="B8C4D0" w:sz="4"/>
+            </w:tcBorders>
+            <w:shd w:fill="EAF1F8" w:color="auto" w:val="clear"/>
+            <w:tcMar>
+              <w:top w:type="dxa" w:w="80"/>
+              <w:left w:type="dxa" w:w="100"/>
+              <w:bottom w:type="dxa" w:w="80"/>
+              <w:right w:type="dxa" w:w="100"/>
+            </w:tcMar>
+          </w:tcPr>
+          <w:p>
+            <w:r>
+              <w:rPr>
+                <w:b w:val="false"/>
+                <w:bCs w:val="false"/>
+                <w:sz w:val="20"/>
+                <w:szCs w:val="20"/>
+              </w:rPr>
+              <w:t xml:space="preserve">1</w:t>
+            </w:r>
+          </w:p>
+        </w:tc>
+        <w:tc>
+          <w:tcPr>
+            <w:tcW w:type="dxa" w:w="3300"/>
+            <w:tcBorders>
+              <w:top w:val="single" w:color="B8C4D0" w:sz="4"/>
+              <w:left w:val="single" w:color="B8C4D0" w:sz="4"/>
+              <w:bottom w:val="single" w:color="B8C4D0" w:sz="4"/>
+              <w:right w:val="single" w:color="B8C4D0" w:sz="4"/>
+            </w:tcBorders>
+            <w:tcMar>
+              <w:top w:type="dxa" w:w="80"/>
+              <w:left w:type="dxa" w:w="100"/>
+              <w:bottom w:type="dxa" w:w="80"/>
+              <w:right w:type="dxa" w:w="100"/>
+            </w:tcMar>
+          </w:tcPr>
+          <w:p>
+            <w:r>
+              <w:rPr>
+                <w:b w:val="false"/>
+                <w:bCs w:val="false"/>
+                <w:sz w:val="20"/>
+                <w:szCs w:val="20"/>
+              </w:rPr>
+              <w:t xml:space="preserve">Ouvrez « Validation des demandes de compte ».</w:t>
+            </w:r>
+          </w:p>
+        </w:tc>
+        <w:tc>
+          <w:tcPr>
+            <w:tcW w:type="dxa" w:w="2800"/>
+            <w:tcBorders>
+              <w:top w:val="single" w:color="B8C4D0" w:sz="4"/>
+              <w:left w:val="single" w:color="B8C4D0" w:sz="4"/>
+              <w:bottom w:val="single" w:color="B8C4D0" w:sz="4"/>
+              <w:right w:val="single" w:color="B8C4D0" w:sz="4"/>
+            </w:tcBorders>
+            <w:tcMar>
+              <w:top w:type="dxa" w:w="80"/>
+              <w:left w:type="dxa" w:w="100"/>
+              <w:bottom w:type="dxa" w:w="80"/>
+              <w:right w:type="dxa" w:w="100"/>
+            </w:tcMar>
+          </w:tcPr>
+          <w:p>
+            <w:r>
+              <w:rPr>
+                <w:b w:val="false"/>
+                <w:bCs w:val="false"/>
+                <w:sz w:val="20"/>
+                <w:szCs w:val="20"/>
+              </w:rPr>
+              <w:t xml:space="preserve">Chaque pièce s'affiche par son nom en clair (ex. « Pièce d'identité du représentant légal ») ; le nom du fichier apparaît au survol.</w:t>
+            </w:r>
+          </w:p>
+        </w:tc>
+        <w:tc>
+          <w:tcPr>
+            <w:tcW w:type="dxa" w:w="1800"/>
+            <w:tcBorders>
+              <w:top w:val="single" w:color="B8C4D0" w:sz="4"/>
+              <w:left w:val="single" w:color="B8C4D0" w:sz="4"/>
+              <w:bottom w:val="single" w:color="B8C4D0" w:sz="4"/>
+              <w:right w:val="single" w:color="B8C4D0" w:sz="4"/>
+            </w:tcBorders>
+            <w:tcMar>
+              <w:top w:type="dxa" w:w="80"/>
+              <w:left w:type="dxa" w:w="100"/>
+              <w:bottom w:type="dxa" w:w="80"/>
+              <w:right w:type="dxa" w:w="100"/>
+            </w:tcMar>
+          </w:tcPr>
+          <w:p>
+            <w:r>
+              <w:rPr>
+                <w:b w:val="false"/>
+                <w:bCs w:val="false"/>
+                <w:sz w:val="20"/>
+                <w:szCs w:val="20"/>
+              </w:rPr>
+              <w:t xml:space="preserve">☐ Ça marche</w:t>
+            </w:r>
+          </w:p>
+          <w:p>
+            <w:r>
+              <w:rPr>
+                <w:b w:val="false"/>
+                <w:bCs w:val="false"/>
+                <w:sz w:val="20"/>
+                <w:szCs w:val="20"/>
+              </w:rPr>
+              <w:t xml:space="preserve">☐ Ne marche pas</w:t>
+            </w:r>
+          </w:p>
+          <w:p>
+            <w:r>
+              <w:rPr>
+                <w:b w:val="false"/>
+                <w:bCs w:val="false"/>
+                <w:sz w:val="20"/>
+                <w:szCs w:val="20"/>
+              </w:rPr>
+              <w:t xml:space="preserve">☐ Pas compris</w:t>
+            </w:r>
+          </w:p>
+        </w:tc>
+        <w:tc>
+          <w:tcPr>
+            <w:tcW w:type="dxa" w:w="1526"/>
+            <w:tcBorders>
+              <w:top w:val="single" w:color="B8C4D0" w:sz="4"/>
+              <w:left w:val="single" w:color="B8C4D0" w:sz="4"/>
+              <w:bottom w:val="single" w:color="B8C4D0" w:sz="4"/>
+              <w:right w:val="single" w:color="B8C4D0" w:sz="4"/>
+            </w:tcBorders>
+            <w:tcMar>
+              <w:top w:type="dxa" w:w="80"/>
+              <w:left w:type="dxa" w:w="100"/>
+              <w:bottom w:type="dxa" w:w="80"/>
+              <w:right w:type="dxa" w:w="100"/>
+            </w:tcMar>
+          </w:tcPr>
+          <w:p>
+            <w:r>
+              <w:rPr>
+                <w:b w:val="false"/>
+                <w:bCs w:val="false"/>
+                <w:sz w:val="20"/>
+                <w:szCs w:val="20"/>
+              </w:rPr>
+              <w:t xml:space="preserve"/>
+            </w:r>
+          </w:p>
+        </w:tc>
+      </w:tr>
+      <w:tr>
+        <w:trPr>
+          <w:cantSplit/>
+        </w:trPr>
+        <w:tc>
+          <w:tcPr>
+            <w:tcW w:type="dxa" w:w="480"/>
+            <w:tcBorders>
+              <w:top w:val="single" w:color="B8C4D0" w:sz="4"/>
+              <w:left w:val="single" w:color="B8C4D0" w:sz="4"/>
+              <w:bottom w:val="single" w:color="B8C4D0" w:sz="4"/>
+              <w:right w:val="single" w:color="B8C4D0" w:sz="4"/>
+            </w:tcBorders>
+            <w:shd w:fill="EAF1F8" w:color="auto" w:val="clear"/>
+            <w:tcMar>
+              <w:top w:type="dxa" w:w="80"/>
+              <w:left w:type="dxa" w:w="100"/>
+              <w:bottom w:type="dxa" w:w="80"/>
+              <w:right w:type="dxa" w:w="100"/>
+            </w:tcMar>
+          </w:tcPr>
+          <w:p>
+            <w:r>
+              <w:rPr>
+                <w:b w:val="false"/>
+                <w:bCs w:val="false"/>
+                <w:sz w:val="20"/>
+                <w:szCs w:val="20"/>
+              </w:rPr>
+              <w:t xml:space="preserve">2</w:t>
+            </w:r>
+          </w:p>
+        </w:tc>
+        <w:tc>
+          <w:tcPr>
+            <w:tcW w:type="dxa" w:w="3300"/>
+            <w:tcBorders>
+              <w:top w:val="single" w:color="B8C4D0" w:sz="4"/>
+              <w:left w:val="single" w:color="B8C4D0" w:sz="4"/>
+              <w:bottom w:val="single" w:color="B8C4D0" w:sz="4"/>
+              <w:right w:val="single" w:color="B8C4D0" w:sz="4"/>
+            </w:tcBorders>
+            <w:tcMar>
+              <w:top w:type="dxa" w:w="80"/>
+              <w:left w:type="dxa" w:w="100"/>
+              <w:bottom w:type="dxa" w:w="80"/>
+              <w:right w:type="dxa" w:w="100"/>
+            </w:tcMar>
+          </w:tcPr>
+          <w:p>
+            <w:r>
+              <w:rPr>
+                <w:b w:val="false"/>
+                <w:bCs w:val="false"/>
+                <w:sz w:val="20"/>
+                <w:szCs w:val="20"/>
+              </w:rPr>
+              <w:t xml:space="preserve">Vérifiez le « Profil déclaré » (Normal, En compte, Deposit, IES, Transporteur) puis « Valider ».</w:t>
+            </w:r>
+          </w:p>
+        </w:tc>
+        <w:tc>
+          <w:tcPr>
+            <w:tcW w:type="dxa" w:w="2800"/>
+            <w:tcBorders>
+              <w:top w:val="single" w:color="B8C4D0" w:sz="4"/>
+              <w:left w:val="single" w:color="B8C4D0" w:sz="4"/>
+              <w:bottom w:val="single" w:color="B8C4D0" w:sz="4"/>
+              <w:right w:val="single" w:color="B8C4D0" w:sz="4"/>
+            </w:tcBorders>
+            <w:tcMar>
+              <w:top w:type="dxa" w:w="80"/>
+              <w:left w:type="dxa" w:w="100"/>
+              <w:bottom w:type="dxa" w:w="80"/>
+              <w:right w:type="dxa" w:w="100"/>
+            </w:tcMar>
+          </w:tcPr>
+          <w:p>
+            <w:r>
+              <w:rPr>
+                <w:b w:val="false"/>
+                <w:bCs w:val="false"/>
+                <w:sz w:val="20"/>
+                <w:szCs w:val="20"/>
+              </w:rPr>
+              <w:t xml:space="preserve">Le compte est activé et le demandeur reçoit un e-mail.</w:t>
+            </w:r>
+          </w:p>
+        </w:tc>
+        <w:tc>
+          <w:tcPr>
+            <w:tcW w:type="dxa" w:w="1800"/>
+            <w:tcBorders>
+              <w:top w:val="single" w:color="B8C4D0" w:sz="4"/>
+              <w:left w:val="single" w:color="B8C4D0" w:sz="4"/>
+              <w:bottom w:val="single" w:color="B8C4D0" w:sz="4"/>
+              <w:right w:val="single" w:color="B8C4D0" w:sz="4"/>
+            </w:tcBorders>
+            <w:tcMar>
+              <w:top w:type="dxa" w:w="80"/>
+              <w:left w:type="dxa" w:w="100"/>
+              <w:bottom w:type="dxa" w:w="80"/>
+              <w:right w:type="dxa" w:w="100"/>
+            </w:tcMar>
+          </w:tcPr>
+          <w:p>
+            <w:r>
+              <w:rPr>
+                <w:b w:val="false"/>
+                <w:bCs w:val="false"/>
+                <w:sz w:val="20"/>
+                <w:szCs w:val="20"/>
+              </w:rPr>
+              <w:t xml:space="preserve">☐ Ça marche</w:t>
+            </w:r>
+          </w:p>
+          <w:p>
+            <w:r>
+              <w:rPr>
+                <w:b w:val="false"/>
+                <w:bCs w:val="false"/>
+                <w:sz w:val="20"/>
+                <w:szCs w:val="20"/>
+              </w:rPr>
+              <w:t xml:space="preserve">☐ Ne marche pas</w:t>
+            </w:r>
+          </w:p>
+          <w:p>
+            <w:r>
+              <w:rPr>
+                <w:b w:val="false"/>
+                <w:bCs w:val="false"/>
+                <w:sz w:val="20"/>
+                <w:szCs w:val="20"/>
+              </w:rPr>
+              <w:t xml:space="preserve">☐ Pas compris</w:t>
+            </w:r>
+          </w:p>
+        </w:tc>
+        <w:tc>
+          <w:tcPr>
+            <w:tcW w:type="dxa" w:w="1526"/>
+            <w:tcBorders>
+              <w:top w:val="single" w:color="B8C4D0" w:sz="4"/>
+              <w:left w:val="single" w:color="B8C4D0" w:sz="4"/>
+              <w:bottom w:val="single" w:color="B8C4D0" w:sz="4"/>
+              <w:right w:val="single" w:color="B8C4D0" w:sz="4"/>
+            </w:tcBorders>
+            <w:tcMar>
+              <w:top w:type="dxa" w:w="80"/>
+              <w:left w:type="dxa" w:w="100"/>
+              <w:bottom w:type="dxa" w:w="80"/>
+              <w:right w:type="dxa" w:w="100"/>
+            </w:tcMar>
+          </w:tcPr>
+          <w:p>
+            <w:r>
+              <w:rPr>
+                <w:b w:val="false"/>
+                <w:bCs w:val="false"/>
+                <w:sz w:val="20"/>
+                <w:szCs w:val="20"/>
+              </w:rPr>
+              <w:t xml:space="preserve"/>
+            </w:r>
+          </w:p>
+        </w:tc>
+      </w:tr>
+    </w:tbl>
+    <w:p>
+      <w:pPr>
+        <w:spacing w:after="120"/>
+      </w:pPr>
+      <w:r>
+        <w:t xml:space="preserve"/>
+      </w:r>
+    </w:p>
+    <w:p>
+      <w:pPr>
+        <w:pStyle w:val="Heading1"/>
+      </w:pPr>
+      <w:r>
+        <w:t xml:space="preserve">Partie 12 — Terminer</w:t>
       </w:r>
     </w:p>
     <w:p>

</xml_diff>

<commit_message>
docs(recette): cahier v1.7 et guides v1.4 — formulaires officiels de flotte F-0001/F-0002, plateforme bilingue FR/EN (messages, e-mails, notifications, proforma), parametres de la plateforme, disponibilite mesuree et maintenances planifiees, alerte de panne
</commit_message>
<xml_diff>
--- a/docs/recette/guides-utilisateurs/Guide-de-test-Administrateur-CIT.docx
+++ b/docs/recette/guides-utilisateurs/Guide-de-test-Administrateur-CIT.docx
@@ -57,7 +57,7 @@
           <w:sz w:val="22"/>
           <w:szCs w:val="22"/>
         </w:rPr>
-        <w:t xml:space="preserve">Version 1.3 — 04/10/2026</w:t>
+        <w:t xml:space="preserve">Version 1.4 — 05/10/2026</w:t>
       </w:r>
     </w:p>
     <w:tbl>
@@ -171,7 +171,7 @@
           <w:b/>
           <w:bCs/>
         </w:rPr>
-        <w:t xml:space="preserve">Durée estimée : environ 75 minutes, en 12 parties.</w:t>
+        <w:t xml:space="preserve">Durée estimée : environ 90 minutes, en 14 parties.</w:t>
       </w:r>
     </w:p>
     <w:p>
@@ -7695,7 +7695,1597 @@
         <w:pStyle w:val="Heading1"/>
       </w:pPr>
       <w:r>
-        <w:t xml:space="preserve">Partie 12 — Terminer</w:t>
+        <w:t xml:space="preserve">Partie 12 — Régler les paramètres de la plateforme</w:t>
+      </w:r>
+    </w:p>
+    <w:p>
+      <w:pPr>
+        <w:spacing w:after="120"/>
+        <w:rPr>
+          <w:i/>
+          <w:iCs/>
+        </w:rPr>
+      </w:pPr>
+      <w:r>
+        <w:rPr>
+          <w:i/>
+          <w:iCs/>
+        </w:rPr>
+        <w:t xml:space="preserve">Volumétrie, durées de conservation et disponibilité se règlent sans développement.</w:t>
+      </w:r>
+    </w:p>
+    <w:tbl>
+      <w:tblPr>
+        <w:tblW w:type="dxa" w:w="9906"/>
+        <w:tblBorders>
+          <w:top w:val="single" w:color="auto" w:sz="4"/>
+          <w:left w:val="single" w:color="auto" w:sz="4"/>
+          <w:bottom w:val="single" w:color="auto" w:sz="4"/>
+          <w:right w:val="single" w:color="auto" w:sz="4"/>
+          <w:insideH w:val="single" w:color="auto" w:sz="4"/>
+          <w:insideV w:val="single" w:color="auto" w:sz="4"/>
+        </w:tblBorders>
+      </w:tblPr>
+      <w:tblGrid>
+        <w:gridCol w:w="480"/>
+        <w:gridCol w:w="3300"/>
+        <w:gridCol w:w="2800"/>
+        <w:gridCol w:w="1800"/>
+        <w:gridCol w:w="1526"/>
+      </w:tblGrid>
+      <w:tr>
+        <w:trPr>
+          <w:tblHeader/>
+        </w:trPr>
+        <w:tc>
+          <w:tcPr>
+            <w:tcW w:type="dxa" w:w="480"/>
+            <w:tcBorders>
+              <w:top w:val="single" w:color="B8C4D0" w:sz="4"/>
+              <w:left w:val="single" w:color="B8C4D0" w:sz="4"/>
+              <w:bottom w:val="single" w:color="B8C4D0" w:sz="4"/>
+              <w:right w:val="single" w:color="B8C4D0" w:sz="4"/>
+            </w:tcBorders>
+            <w:shd w:fill="0B3D6E" w:color="auto" w:val="clear"/>
+            <w:tcMar>
+              <w:top w:type="dxa" w:w="80"/>
+              <w:left w:type="dxa" w:w="100"/>
+              <w:bottom w:type="dxa" w:w="80"/>
+              <w:right w:type="dxa" w:w="100"/>
+            </w:tcMar>
+          </w:tcPr>
+          <w:p>
+            <w:r>
+              <w:rPr>
+                <w:b/>
+                <w:bCs/>
+                <w:color w:val="FFFFFF"/>
+                <w:sz w:val="20"/>
+                <w:szCs w:val="20"/>
+              </w:rPr>
+              <w:t xml:space="preserve">N°</w:t>
+            </w:r>
+          </w:p>
+        </w:tc>
+        <w:tc>
+          <w:tcPr>
+            <w:tcW w:type="dxa" w:w="3300"/>
+            <w:tcBorders>
+              <w:top w:val="single" w:color="B8C4D0" w:sz="4"/>
+              <w:left w:val="single" w:color="B8C4D0" w:sz="4"/>
+              <w:bottom w:val="single" w:color="B8C4D0" w:sz="4"/>
+              <w:right w:val="single" w:color="B8C4D0" w:sz="4"/>
+            </w:tcBorders>
+            <w:shd w:fill="0B3D6E" w:color="auto" w:val="clear"/>
+            <w:tcMar>
+              <w:top w:type="dxa" w:w="80"/>
+              <w:left w:type="dxa" w:w="100"/>
+              <w:bottom w:type="dxa" w:w="80"/>
+              <w:right w:type="dxa" w:w="100"/>
+            </w:tcMar>
+          </w:tcPr>
+          <w:p>
+            <w:r>
+              <w:rPr>
+                <w:b/>
+                <w:bCs/>
+                <w:color w:val="FFFFFF"/>
+                <w:sz w:val="20"/>
+                <w:szCs w:val="20"/>
+              </w:rPr>
+              <w:t xml:space="preserve">Ce que vous faites</w:t>
+            </w:r>
+          </w:p>
+        </w:tc>
+        <w:tc>
+          <w:tcPr>
+            <w:tcW w:type="dxa" w:w="2800"/>
+            <w:tcBorders>
+              <w:top w:val="single" w:color="B8C4D0" w:sz="4"/>
+              <w:left w:val="single" w:color="B8C4D0" w:sz="4"/>
+              <w:bottom w:val="single" w:color="B8C4D0" w:sz="4"/>
+              <w:right w:val="single" w:color="B8C4D0" w:sz="4"/>
+            </w:tcBorders>
+            <w:shd w:fill="0B3D6E" w:color="auto" w:val="clear"/>
+            <w:tcMar>
+              <w:top w:type="dxa" w:w="80"/>
+              <w:left w:type="dxa" w:w="100"/>
+              <w:bottom w:type="dxa" w:w="80"/>
+              <w:right w:type="dxa" w:w="100"/>
+            </w:tcMar>
+          </w:tcPr>
+          <w:p>
+            <w:r>
+              <w:rPr>
+                <w:b/>
+                <w:bCs/>
+                <w:color w:val="FFFFFF"/>
+                <w:sz w:val="20"/>
+                <w:szCs w:val="20"/>
+              </w:rPr>
+              <w:t xml:space="preserve">Ce que vous devez voir</w:t>
+            </w:r>
+          </w:p>
+        </w:tc>
+        <w:tc>
+          <w:tcPr>
+            <w:tcW w:type="dxa" w:w="1800"/>
+            <w:tcBorders>
+              <w:top w:val="single" w:color="B8C4D0" w:sz="4"/>
+              <w:left w:val="single" w:color="B8C4D0" w:sz="4"/>
+              <w:bottom w:val="single" w:color="B8C4D0" w:sz="4"/>
+              <w:right w:val="single" w:color="B8C4D0" w:sz="4"/>
+            </w:tcBorders>
+            <w:shd w:fill="0B3D6E" w:color="auto" w:val="clear"/>
+            <w:tcMar>
+              <w:top w:type="dxa" w:w="80"/>
+              <w:left w:type="dxa" w:w="100"/>
+              <w:bottom w:type="dxa" w:w="80"/>
+              <w:right w:type="dxa" w:w="100"/>
+            </w:tcMar>
+          </w:tcPr>
+          <w:p>
+            <w:r>
+              <w:rPr>
+                <w:b/>
+                <w:bCs/>
+                <w:color w:val="FFFFFF"/>
+                <w:sz w:val="20"/>
+                <w:szCs w:val="20"/>
+              </w:rPr>
+              <w:t xml:space="preserve">Résultat</w:t>
+            </w:r>
+          </w:p>
+        </w:tc>
+        <w:tc>
+          <w:tcPr>
+            <w:tcW w:type="dxa" w:w="1526"/>
+            <w:tcBorders>
+              <w:top w:val="single" w:color="B8C4D0" w:sz="4"/>
+              <w:left w:val="single" w:color="B8C4D0" w:sz="4"/>
+              <w:bottom w:val="single" w:color="B8C4D0" w:sz="4"/>
+              <w:right w:val="single" w:color="B8C4D0" w:sz="4"/>
+            </w:tcBorders>
+            <w:shd w:fill="0B3D6E" w:color="auto" w:val="clear"/>
+            <w:tcMar>
+              <w:top w:type="dxa" w:w="80"/>
+              <w:left w:type="dxa" w:w="100"/>
+              <w:bottom w:type="dxa" w:w="80"/>
+              <w:right w:type="dxa" w:w="100"/>
+            </w:tcMar>
+          </w:tcPr>
+          <w:p>
+            <w:r>
+              <w:rPr>
+                <w:b/>
+                <w:bCs/>
+                <w:color w:val="FFFFFF"/>
+                <w:sz w:val="20"/>
+                <w:szCs w:val="20"/>
+              </w:rPr>
+              <w:t xml:space="preserve">Commentaire</w:t>
+            </w:r>
+          </w:p>
+        </w:tc>
+      </w:tr>
+      <w:tr>
+        <w:trPr>
+          <w:cantSplit/>
+        </w:trPr>
+        <w:tc>
+          <w:tcPr>
+            <w:tcW w:type="dxa" w:w="480"/>
+            <w:tcBorders>
+              <w:top w:val="single" w:color="B8C4D0" w:sz="4"/>
+              <w:left w:val="single" w:color="B8C4D0" w:sz="4"/>
+              <w:bottom w:val="single" w:color="B8C4D0" w:sz="4"/>
+              <w:right w:val="single" w:color="B8C4D0" w:sz="4"/>
+            </w:tcBorders>
+            <w:shd w:fill="EAF1F8" w:color="auto" w:val="clear"/>
+            <w:tcMar>
+              <w:top w:type="dxa" w:w="80"/>
+              <w:left w:type="dxa" w:w="100"/>
+              <w:bottom w:type="dxa" w:w="80"/>
+              <w:right w:type="dxa" w:w="100"/>
+            </w:tcMar>
+          </w:tcPr>
+          <w:p>
+            <w:r>
+              <w:rPr>
+                <w:b w:val="false"/>
+                <w:bCs w:val="false"/>
+                <w:sz w:val="20"/>
+                <w:szCs w:val="20"/>
+              </w:rPr>
+              <w:t xml:space="preserve">1</w:t>
+            </w:r>
+          </w:p>
+        </w:tc>
+        <w:tc>
+          <w:tcPr>
+            <w:tcW w:type="dxa" w:w="3300"/>
+            <w:tcBorders>
+              <w:top w:val="single" w:color="B8C4D0" w:sz="4"/>
+              <w:left w:val="single" w:color="B8C4D0" w:sz="4"/>
+              <w:bottom w:val="single" w:color="B8C4D0" w:sz="4"/>
+              <w:right w:val="single" w:color="B8C4D0" w:sz="4"/>
+            </w:tcBorders>
+            <w:tcMar>
+              <w:top w:type="dxa" w:w="80"/>
+              <w:left w:type="dxa" w:w="100"/>
+              <w:bottom w:type="dxa" w:w="80"/>
+              <w:right w:type="dxa" w:w="100"/>
+            </w:tcMar>
+          </w:tcPr>
+          <w:p>
+            <w:r>
+              <w:rPr>
+                <w:b w:val="false"/>
+                <w:bCs w:val="false"/>
+                <w:sz w:val="20"/>
+                <w:szCs w:val="20"/>
+              </w:rPr>
+              <w:t xml:space="preserve">Ouvrez « Paramètres de la plateforme ». Passez « BL par demande d'import » à 4 et enregistrez.</w:t>
+            </w:r>
+          </w:p>
+        </w:tc>
+        <w:tc>
+          <w:tcPr>
+            <w:tcW w:type="dxa" w:w="2800"/>
+            <w:tcBorders>
+              <w:top w:val="single" w:color="B8C4D0" w:sz="4"/>
+              <w:left w:val="single" w:color="B8C4D0" w:sz="4"/>
+              <w:bottom w:val="single" w:color="B8C4D0" w:sz="4"/>
+              <w:right w:val="single" w:color="B8C4D0" w:sz="4"/>
+            </w:tcBorders>
+            <w:tcMar>
+              <w:top w:type="dxa" w:w="80"/>
+              <w:left w:type="dxa" w:w="100"/>
+              <w:bottom w:type="dxa" w:w="80"/>
+              <w:right w:type="dxa" w:w="100"/>
+            </w:tcMar>
+          </w:tcPr>
+          <w:p>
+            <w:r>
+              <w:rPr>
+                <w:b w:val="false"/>
+                <w:bCs w:val="false"/>
+                <w:sz w:val="20"/>
+                <w:szCs w:val="20"/>
+              </w:rPr>
+              <w:t xml:space="preserve">Le message « … enregistré » s'affiche ; la ligne indique la date de modification.</w:t>
+            </w:r>
+          </w:p>
+        </w:tc>
+        <w:tc>
+          <w:tcPr>
+            <w:tcW w:type="dxa" w:w="1800"/>
+            <w:tcBorders>
+              <w:top w:val="single" w:color="B8C4D0" w:sz="4"/>
+              <w:left w:val="single" w:color="B8C4D0" w:sz="4"/>
+              <w:bottom w:val="single" w:color="B8C4D0" w:sz="4"/>
+              <w:right w:val="single" w:color="B8C4D0" w:sz="4"/>
+            </w:tcBorders>
+            <w:tcMar>
+              <w:top w:type="dxa" w:w="80"/>
+              <w:left w:type="dxa" w:w="100"/>
+              <w:bottom w:type="dxa" w:w="80"/>
+              <w:right w:type="dxa" w:w="100"/>
+            </w:tcMar>
+          </w:tcPr>
+          <w:p>
+            <w:r>
+              <w:rPr>
+                <w:b w:val="false"/>
+                <w:bCs w:val="false"/>
+                <w:sz w:val="20"/>
+                <w:szCs w:val="20"/>
+              </w:rPr>
+              <w:t xml:space="preserve">☐ Ça marche</w:t>
+            </w:r>
+          </w:p>
+          <w:p>
+            <w:r>
+              <w:rPr>
+                <w:b w:val="false"/>
+                <w:bCs w:val="false"/>
+                <w:sz w:val="20"/>
+                <w:szCs w:val="20"/>
+              </w:rPr>
+              <w:t xml:space="preserve">☐ Ne marche pas</w:t>
+            </w:r>
+          </w:p>
+          <w:p>
+            <w:r>
+              <w:rPr>
+                <w:b w:val="false"/>
+                <w:bCs w:val="false"/>
+                <w:sz w:val="20"/>
+                <w:szCs w:val="20"/>
+              </w:rPr>
+              <w:t xml:space="preserve">☐ Pas compris</w:t>
+            </w:r>
+          </w:p>
+        </w:tc>
+        <w:tc>
+          <w:tcPr>
+            <w:tcW w:type="dxa" w:w="1526"/>
+            <w:tcBorders>
+              <w:top w:val="single" w:color="B8C4D0" w:sz="4"/>
+              <w:left w:val="single" w:color="B8C4D0" w:sz="4"/>
+              <w:bottom w:val="single" w:color="B8C4D0" w:sz="4"/>
+              <w:right w:val="single" w:color="B8C4D0" w:sz="4"/>
+            </w:tcBorders>
+            <w:tcMar>
+              <w:top w:type="dxa" w:w="80"/>
+              <w:left w:type="dxa" w:w="100"/>
+              <w:bottom w:type="dxa" w:w="80"/>
+              <w:right w:type="dxa" w:w="100"/>
+            </w:tcMar>
+          </w:tcPr>
+          <w:p>
+            <w:r>
+              <w:rPr>
+                <w:b w:val="false"/>
+                <w:bCs w:val="false"/>
+                <w:sz w:val="20"/>
+                <w:szCs w:val="20"/>
+              </w:rPr>
+              <w:t xml:space="preserve"/>
+            </w:r>
+          </w:p>
+        </w:tc>
+      </w:tr>
+      <w:tr>
+        <w:trPr>
+          <w:cantSplit/>
+        </w:trPr>
+        <w:tc>
+          <w:tcPr>
+            <w:tcW w:type="dxa" w:w="480"/>
+            <w:tcBorders>
+              <w:top w:val="single" w:color="B8C4D0" w:sz="4"/>
+              <w:left w:val="single" w:color="B8C4D0" w:sz="4"/>
+              <w:bottom w:val="single" w:color="B8C4D0" w:sz="4"/>
+              <w:right w:val="single" w:color="B8C4D0" w:sz="4"/>
+            </w:tcBorders>
+            <w:shd w:fill="EAF1F8" w:color="auto" w:val="clear"/>
+            <w:tcMar>
+              <w:top w:type="dxa" w:w="80"/>
+              <w:left w:type="dxa" w:w="100"/>
+              <w:bottom w:type="dxa" w:w="80"/>
+              <w:right w:type="dxa" w:w="100"/>
+            </w:tcMar>
+          </w:tcPr>
+          <w:p>
+            <w:r>
+              <w:rPr>
+                <w:b w:val="false"/>
+                <w:bCs w:val="false"/>
+                <w:sz w:val="20"/>
+                <w:szCs w:val="20"/>
+              </w:rPr>
+              <w:t xml:space="preserve">2</w:t>
+            </w:r>
+          </w:p>
+        </w:tc>
+        <w:tc>
+          <w:tcPr>
+            <w:tcW w:type="dxa" w:w="3300"/>
+            <w:tcBorders>
+              <w:top w:val="single" w:color="B8C4D0" w:sz="4"/>
+              <w:left w:val="single" w:color="B8C4D0" w:sz="4"/>
+              <w:bottom w:val="single" w:color="B8C4D0" w:sz="4"/>
+              <w:right w:val="single" w:color="B8C4D0" w:sz="4"/>
+            </w:tcBorders>
+            <w:tcMar>
+              <w:top w:type="dxa" w:w="80"/>
+              <w:left w:type="dxa" w:w="100"/>
+              <w:bottom w:type="dxa" w:w="80"/>
+              <w:right w:type="dxa" w:w="100"/>
+            </w:tcMar>
+          </w:tcPr>
+          <w:p>
+            <w:r>
+              <w:rPr>
+                <w:b w:val="false"/>
+                <w:bCs w:val="false"/>
+                <w:sz w:val="20"/>
+                <w:szCs w:val="20"/>
+              </w:rPr>
+              <w:t xml:space="preserve">Connectez-vous comme client et ouvrez « Demande IMPORT (BL) ».</w:t>
+            </w:r>
+          </w:p>
+        </w:tc>
+        <w:tc>
+          <w:tcPr>
+            <w:tcW w:type="dxa" w:w="2800"/>
+            <w:tcBorders>
+              <w:top w:val="single" w:color="B8C4D0" w:sz="4"/>
+              <w:left w:val="single" w:color="B8C4D0" w:sz="4"/>
+              <w:bottom w:val="single" w:color="B8C4D0" w:sz="4"/>
+              <w:right w:val="single" w:color="B8C4D0" w:sz="4"/>
+            </w:tcBorders>
+            <w:tcMar>
+              <w:top w:type="dxa" w:w="80"/>
+              <w:left w:type="dxa" w:w="100"/>
+              <w:bottom w:type="dxa" w:w="80"/>
+              <w:right w:type="dxa" w:w="100"/>
+            </w:tcMar>
+          </w:tcPr>
+          <w:p>
+            <w:r>
+              <w:rPr>
+                <w:b w:val="false"/>
+                <w:bCs w:val="false"/>
+                <w:sz w:val="20"/>
+                <w:szCs w:val="20"/>
+              </w:rPr>
+              <w:t xml:space="preserve">Le compteur affiche « 0 / 4 BL saisis ».</w:t>
+            </w:r>
+          </w:p>
+        </w:tc>
+        <w:tc>
+          <w:tcPr>
+            <w:tcW w:type="dxa" w:w="1800"/>
+            <w:tcBorders>
+              <w:top w:val="single" w:color="B8C4D0" w:sz="4"/>
+              <w:left w:val="single" w:color="B8C4D0" w:sz="4"/>
+              <w:bottom w:val="single" w:color="B8C4D0" w:sz="4"/>
+              <w:right w:val="single" w:color="B8C4D0" w:sz="4"/>
+            </w:tcBorders>
+            <w:tcMar>
+              <w:top w:type="dxa" w:w="80"/>
+              <w:left w:type="dxa" w:w="100"/>
+              <w:bottom w:type="dxa" w:w="80"/>
+              <w:right w:type="dxa" w:w="100"/>
+            </w:tcMar>
+          </w:tcPr>
+          <w:p>
+            <w:r>
+              <w:rPr>
+                <w:b w:val="false"/>
+                <w:bCs w:val="false"/>
+                <w:sz w:val="20"/>
+                <w:szCs w:val="20"/>
+              </w:rPr>
+              <w:t xml:space="preserve">☐ Ça marche</w:t>
+            </w:r>
+          </w:p>
+          <w:p>
+            <w:r>
+              <w:rPr>
+                <w:b w:val="false"/>
+                <w:bCs w:val="false"/>
+                <w:sz w:val="20"/>
+                <w:szCs w:val="20"/>
+              </w:rPr>
+              <w:t xml:space="preserve">☐ Ne marche pas</w:t>
+            </w:r>
+          </w:p>
+          <w:p>
+            <w:r>
+              <w:rPr>
+                <w:b w:val="false"/>
+                <w:bCs w:val="false"/>
+                <w:sz w:val="20"/>
+                <w:szCs w:val="20"/>
+              </w:rPr>
+              <w:t xml:space="preserve">☐ Pas compris</w:t>
+            </w:r>
+          </w:p>
+        </w:tc>
+        <w:tc>
+          <w:tcPr>
+            <w:tcW w:type="dxa" w:w="1526"/>
+            <w:tcBorders>
+              <w:top w:val="single" w:color="B8C4D0" w:sz="4"/>
+              <w:left w:val="single" w:color="B8C4D0" w:sz="4"/>
+              <w:bottom w:val="single" w:color="B8C4D0" w:sz="4"/>
+              <w:right w:val="single" w:color="B8C4D0" w:sz="4"/>
+            </w:tcBorders>
+            <w:tcMar>
+              <w:top w:type="dxa" w:w="80"/>
+              <w:left w:type="dxa" w:w="100"/>
+              <w:bottom w:type="dxa" w:w="80"/>
+              <w:right w:type="dxa" w:w="100"/>
+            </w:tcMar>
+          </w:tcPr>
+          <w:p>
+            <w:r>
+              <w:rPr>
+                <w:b w:val="false"/>
+                <w:bCs w:val="false"/>
+                <w:sz w:val="20"/>
+                <w:szCs w:val="20"/>
+              </w:rPr>
+              <w:t xml:space="preserve"/>
+            </w:r>
+          </w:p>
+        </w:tc>
+      </w:tr>
+      <w:tr>
+        <w:trPr>
+          <w:cantSplit/>
+        </w:trPr>
+        <w:tc>
+          <w:tcPr>
+            <w:tcW w:type="dxa" w:w="480"/>
+            <w:tcBorders>
+              <w:top w:val="single" w:color="B8C4D0" w:sz="4"/>
+              <w:left w:val="single" w:color="B8C4D0" w:sz="4"/>
+              <w:bottom w:val="single" w:color="B8C4D0" w:sz="4"/>
+              <w:right w:val="single" w:color="B8C4D0" w:sz="4"/>
+            </w:tcBorders>
+            <w:shd w:fill="EAF1F8" w:color="auto" w:val="clear"/>
+            <w:tcMar>
+              <w:top w:type="dxa" w:w="80"/>
+              <w:left w:type="dxa" w:w="100"/>
+              <w:bottom w:type="dxa" w:w="80"/>
+              <w:right w:type="dxa" w:w="100"/>
+            </w:tcMar>
+          </w:tcPr>
+          <w:p>
+            <w:r>
+              <w:rPr>
+                <w:b w:val="false"/>
+                <w:bCs w:val="false"/>
+                <w:sz w:val="20"/>
+                <w:szCs w:val="20"/>
+              </w:rPr>
+              <w:t xml:space="preserve">3</w:t>
+            </w:r>
+          </w:p>
+        </w:tc>
+        <w:tc>
+          <w:tcPr>
+            <w:tcW w:type="dxa" w:w="3300"/>
+            <w:tcBorders>
+              <w:top w:val="single" w:color="B8C4D0" w:sz="4"/>
+              <w:left w:val="single" w:color="B8C4D0" w:sz="4"/>
+              <w:bottom w:val="single" w:color="B8C4D0" w:sz="4"/>
+              <w:right w:val="single" w:color="B8C4D0" w:sz="4"/>
+            </w:tcBorders>
+            <w:tcMar>
+              <w:top w:type="dxa" w:w="80"/>
+              <w:left w:type="dxa" w:w="100"/>
+              <w:bottom w:type="dxa" w:w="80"/>
+              <w:right w:type="dxa" w:w="100"/>
+            </w:tcMar>
+          </w:tcPr>
+          <w:p>
+            <w:r>
+              <w:rPr>
+                <w:b w:val="false"/>
+                <w:bCs w:val="false"/>
+                <w:sz w:val="20"/>
+                <w:szCs w:val="20"/>
+              </w:rPr>
+              <w:t xml:space="preserve">Revenez, remettez 5, puis essayez 0.</w:t>
+            </w:r>
+          </w:p>
+        </w:tc>
+        <w:tc>
+          <w:tcPr>
+            <w:tcW w:type="dxa" w:w="2800"/>
+            <w:tcBorders>
+              <w:top w:val="single" w:color="B8C4D0" w:sz="4"/>
+              <w:left w:val="single" w:color="B8C4D0" w:sz="4"/>
+              <w:bottom w:val="single" w:color="B8C4D0" w:sz="4"/>
+              <w:right w:val="single" w:color="B8C4D0" w:sz="4"/>
+            </w:tcBorders>
+            <w:tcMar>
+              <w:top w:type="dxa" w:w="80"/>
+              <w:left w:type="dxa" w:w="100"/>
+              <w:bottom w:type="dxa" w:w="80"/>
+              <w:right w:type="dxa" w:w="100"/>
+            </w:tcMar>
+          </w:tcPr>
+          <w:p>
+            <w:r>
+              <w:rPr>
+                <w:b w:val="false"/>
+                <w:bCs w:val="false"/>
+                <w:sz w:val="20"/>
+                <w:szCs w:val="20"/>
+              </w:rPr>
+              <w:t xml:space="preserve">5 est accepté ; 0 est refusé avec un message clair.</w:t>
+            </w:r>
+          </w:p>
+        </w:tc>
+        <w:tc>
+          <w:tcPr>
+            <w:tcW w:type="dxa" w:w="1800"/>
+            <w:tcBorders>
+              <w:top w:val="single" w:color="B8C4D0" w:sz="4"/>
+              <w:left w:val="single" w:color="B8C4D0" w:sz="4"/>
+              <w:bottom w:val="single" w:color="B8C4D0" w:sz="4"/>
+              <w:right w:val="single" w:color="B8C4D0" w:sz="4"/>
+            </w:tcBorders>
+            <w:tcMar>
+              <w:top w:type="dxa" w:w="80"/>
+              <w:left w:type="dxa" w:w="100"/>
+              <w:bottom w:type="dxa" w:w="80"/>
+              <w:right w:type="dxa" w:w="100"/>
+            </w:tcMar>
+          </w:tcPr>
+          <w:p>
+            <w:r>
+              <w:rPr>
+                <w:b w:val="false"/>
+                <w:bCs w:val="false"/>
+                <w:sz w:val="20"/>
+                <w:szCs w:val="20"/>
+              </w:rPr>
+              <w:t xml:space="preserve">☐ Ça marche</w:t>
+            </w:r>
+          </w:p>
+          <w:p>
+            <w:r>
+              <w:rPr>
+                <w:b w:val="false"/>
+                <w:bCs w:val="false"/>
+                <w:sz w:val="20"/>
+                <w:szCs w:val="20"/>
+              </w:rPr>
+              <w:t xml:space="preserve">☐ Ne marche pas</w:t>
+            </w:r>
+          </w:p>
+          <w:p>
+            <w:r>
+              <w:rPr>
+                <w:b w:val="false"/>
+                <w:bCs w:val="false"/>
+                <w:sz w:val="20"/>
+                <w:szCs w:val="20"/>
+              </w:rPr>
+              <w:t xml:space="preserve">☐ Pas compris</w:t>
+            </w:r>
+          </w:p>
+        </w:tc>
+        <w:tc>
+          <w:tcPr>
+            <w:tcW w:type="dxa" w:w="1526"/>
+            <w:tcBorders>
+              <w:top w:val="single" w:color="B8C4D0" w:sz="4"/>
+              <w:left w:val="single" w:color="B8C4D0" w:sz="4"/>
+              <w:bottom w:val="single" w:color="B8C4D0" w:sz="4"/>
+              <w:right w:val="single" w:color="B8C4D0" w:sz="4"/>
+            </w:tcBorders>
+            <w:tcMar>
+              <w:top w:type="dxa" w:w="80"/>
+              <w:left w:type="dxa" w:w="100"/>
+              <w:bottom w:type="dxa" w:w="80"/>
+              <w:right w:type="dxa" w:w="100"/>
+            </w:tcMar>
+          </w:tcPr>
+          <w:p>
+            <w:r>
+              <w:rPr>
+                <w:b w:val="false"/>
+                <w:bCs w:val="false"/>
+                <w:sz w:val="20"/>
+                <w:szCs w:val="20"/>
+              </w:rPr>
+              <w:t xml:space="preserve"/>
+            </w:r>
+          </w:p>
+        </w:tc>
+      </w:tr>
+      <w:tr>
+        <w:trPr>
+          <w:cantSplit/>
+        </w:trPr>
+        <w:tc>
+          <w:tcPr>
+            <w:tcW w:type="dxa" w:w="480"/>
+            <w:tcBorders>
+              <w:top w:val="single" w:color="B8C4D0" w:sz="4"/>
+              <w:left w:val="single" w:color="B8C4D0" w:sz="4"/>
+              <w:bottom w:val="single" w:color="B8C4D0" w:sz="4"/>
+              <w:right w:val="single" w:color="B8C4D0" w:sz="4"/>
+            </w:tcBorders>
+            <w:shd w:fill="EAF1F8" w:color="auto" w:val="clear"/>
+            <w:tcMar>
+              <w:top w:type="dxa" w:w="80"/>
+              <w:left w:type="dxa" w:w="100"/>
+              <w:bottom w:type="dxa" w:w="80"/>
+              <w:right w:type="dxa" w:w="100"/>
+            </w:tcMar>
+          </w:tcPr>
+          <w:p>
+            <w:r>
+              <w:rPr>
+                <w:b w:val="false"/>
+                <w:bCs w:val="false"/>
+                <w:sz w:val="20"/>
+                <w:szCs w:val="20"/>
+              </w:rPr>
+              <w:t xml:space="preserve">4</w:t>
+            </w:r>
+          </w:p>
+        </w:tc>
+        <w:tc>
+          <w:tcPr>
+            <w:tcW w:type="dxa" w:w="3300"/>
+            <w:tcBorders>
+              <w:top w:val="single" w:color="B8C4D0" w:sz="4"/>
+              <w:left w:val="single" w:color="B8C4D0" w:sz="4"/>
+              <w:bottom w:val="single" w:color="B8C4D0" w:sz="4"/>
+              <w:right w:val="single" w:color="B8C4D0" w:sz="4"/>
+            </w:tcBorders>
+            <w:tcMar>
+              <w:top w:type="dxa" w:w="80"/>
+              <w:left w:type="dxa" w:w="100"/>
+              <w:bottom w:type="dxa" w:w="80"/>
+              <w:right w:type="dxa" w:w="100"/>
+            </w:tcMar>
+          </w:tcPr>
+          <w:p>
+            <w:r>
+              <w:rPr>
+                <w:b w:val="false"/>
+                <w:bCs w:val="false"/>
+                <w:sz w:val="20"/>
+                <w:szCs w:val="20"/>
+              </w:rPr>
+              <w:t xml:space="preserve">Ouvrez le journal d'audit.</w:t>
+            </w:r>
+          </w:p>
+        </w:tc>
+        <w:tc>
+          <w:tcPr>
+            <w:tcW w:type="dxa" w:w="2800"/>
+            <w:tcBorders>
+              <w:top w:val="single" w:color="B8C4D0" w:sz="4"/>
+              <w:left w:val="single" w:color="B8C4D0" w:sz="4"/>
+              <w:bottom w:val="single" w:color="B8C4D0" w:sz="4"/>
+              <w:right w:val="single" w:color="B8C4D0" w:sz="4"/>
+            </w:tcBorders>
+            <w:tcMar>
+              <w:top w:type="dxa" w:w="80"/>
+              <w:left w:type="dxa" w:w="100"/>
+              <w:bottom w:type="dxa" w:w="80"/>
+              <w:right w:type="dxa" w:w="100"/>
+            </w:tcMar>
+          </w:tcPr>
+          <w:p>
+            <w:r>
+              <w:rPr>
+                <w:b w:val="false"/>
+                <w:bCs w:val="false"/>
+                <w:sz w:val="20"/>
+                <w:szCs w:val="20"/>
+              </w:rPr>
+              <w:t xml:space="preserve">Chaque changement apparaît avec l'ancienne et la nouvelle valeur.</w:t>
+            </w:r>
+          </w:p>
+        </w:tc>
+        <w:tc>
+          <w:tcPr>
+            <w:tcW w:type="dxa" w:w="1800"/>
+            <w:tcBorders>
+              <w:top w:val="single" w:color="B8C4D0" w:sz="4"/>
+              <w:left w:val="single" w:color="B8C4D0" w:sz="4"/>
+              <w:bottom w:val="single" w:color="B8C4D0" w:sz="4"/>
+              <w:right w:val="single" w:color="B8C4D0" w:sz="4"/>
+            </w:tcBorders>
+            <w:tcMar>
+              <w:top w:type="dxa" w:w="80"/>
+              <w:left w:type="dxa" w:w="100"/>
+              <w:bottom w:type="dxa" w:w="80"/>
+              <w:right w:type="dxa" w:w="100"/>
+            </w:tcMar>
+          </w:tcPr>
+          <w:p>
+            <w:r>
+              <w:rPr>
+                <w:b w:val="false"/>
+                <w:bCs w:val="false"/>
+                <w:sz w:val="20"/>
+                <w:szCs w:val="20"/>
+              </w:rPr>
+              <w:t xml:space="preserve">☐ Ça marche</w:t>
+            </w:r>
+          </w:p>
+          <w:p>
+            <w:r>
+              <w:rPr>
+                <w:b w:val="false"/>
+                <w:bCs w:val="false"/>
+                <w:sz w:val="20"/>
+                <w:szCs w:val="20"/>
+              </w:rPr>
+              <w:t xml:space="preserve">☐ Ne marche pas</w:t>
+            </w:r>
+          </w:p>
+          <w:p>
+            <w:r>
+              <w:rPr>
+                <w:b w:val="false"/>
+                <w:bCs w:val="false"/>
+                <w:sz w:val="20"/>
+                <w:szCs w:val="20"/>
+              </w:rPr>
+              <w:t xml:space="preserve">☐ Pas compris</w:t>
+            </w:r>
+          </w:p>
+        </w:tc>
+        <w:tc>
+          <w:tcPr>
+            <w:tcW w:type="dxa" w:w="1526"/>
+            <w:tcBorders>
+              <w:top w:val="single" w:color="B8C4D0" w:sz="4"/>
+              <w:left w:val="single" w:color="B8C4D0" w:sz="4"/>
+              <w:bottom w:val="single" w:color="B8C4D0" w:sz="4"/>
+              <w:right w:val="single" w:color="B8C4D0" w:sz="4"/>
+            </w:tcBorders>
+            <w:tcMar>
+              <w:top w:type="dxa" w:w="80"/>
+              <w:left w:type="dxa" w:w="100"/>
+              <w:bottom w:type="dxa" w:w="80"/>
+              <w:right w:type="dxa" w:w="100"/>
+            </w:tcMar>
+          </w:tcPr>
+          <w:p>
+            <w:r>
+              <w:rPr>
+                <w:b w:val="false"/>
+                <w:bCs w:val="false"/>
+                <w:sz w:val="20"/>
+                <w:szCs w:val="20"/>
+              </w:rPr>
+              <w:t xml:space="preserve"/>
+            </w:r>
+          </w:p>
+        </w:tc>
+      </w:tr>
+    </w:tbl>
+    <w:p>
+      <w:pPr>
+        <w:spacing w:after="120"/>
+      </w:pPr>
+      <w:r>
+        <w:t xml:space="preserve"/>
+      </w:r>
+    </w:p>
+    <w:p>
+      <w:pPr>
+        <w:pStyle w:val="Heading1"/>
+      </w:pPr>
+      <w:r>
+        <w:t xml:space="preserve">Partie 13 — Suivre la disponibilité de la plateforme</w:t>
+      </w:r>
+    </w:p>
+    <w:p>
+      <w:pPr>
+        <w:spacing w:after="120"/>
+        <w:rPr>
+          <w:i/>
+          <w:iCs/>
+        </w:rPr>
+      </w:pPr>
+      <w:r>
+        <w:rPr>
+          <w:i/>
+          <w:iCs/>
+        </w:rPr>
+        <w:t xml:space="preserve">YABA mesure lui-même sa disponibilité (objectif 99 %).</w:t>
+      </w:r>
+    </w:p>
+    <w:tbl>
+      <w:tblPr>
+        <w:tblW w:type="dxa" w:w="9906"/>
+        <w:tblBorders>
+          <w:top w:val="single" w:color="auto" w:sz="4"/>
+          <w:left w:val="single" w:color="auto" w:sz="4"/>
+          <w:bottom w:val="single" w:color="auto" w:sz="4"/>
+          <w:right w:val="single" w:color="auto" w:sz="4"/>
+          <w:insideH w:val="single" w:color="auto" w:sz="4"/>
+          <w:insideV w:val="single" w:color="auto" w:sz="4"/>
+        </w:tblBorders>
+      </w:tblPr>
+      <w:tblGrid>
+        <w:gridCol w:w="480"/>
+        <w:gridCol w:w="3300"/>
+        <w:gridCol w:w="2800"/>
+        <w:gridCol w:w="1800"/>
+        <w:gridCol w:w="1526"/>
+      </w:tblGrid>
+      <w:tr>
+        <w:trPr>
+          <w:tblHeader/>
+        </w:trPr>
+        <w:tc>
+          <w:tcPr>
+            <w:tcW w:type="dxa" w:w="480"/>
+            <w:tcBorders>
+              <w:top w:val="single" w:color="B8C4D0" w:sz="4"/>
+              <w:left w:val="single" w:color="B8C4D0" w:sz="4"/>
+              <w:bottom w:val="single" w:color="B8C4D0" w:sz="4"/>
+              <w:right w:val="single" w:color="B8C4D0" w:sz="4"/>
+            </w:tcBorders>
+            <w:shd w:fill="0B3D6E" w:color="auto" w:val="clear"/>
+            <w:tcMar>
+              <w:top w:type="dxa" w:w="80"/>
+              <w:left w:type="dxa" w:w="100"/>
+              <w:bottom w:type="dxa" w:w="80"/>
+              <w:right w:type="dxa" w:w="100"/>
+            </w:tcMar>
+          </w:tcPr>
+          <w:p>
+            <w:r>
+              <w:rPr>
+                <w:b/>
+                <w:bCs/>
+                <w:color w:val="FFFFFF"/>
+                <w:sz w:val="20"/>
+                <w:szCs w:val="20"/>
+              </w:rPr>
+              <w:t xml:space="preserve">N°</w:t>
+            </w:r>
+          </w:p>
+        </w:tc>
+        <w:tc>
+          <w:tcPr>
+            <w:tcW w:type="dxa" w:w="3300"/>
+            <w:tcBorders>
+              <w:top w:val="single" w:color="B8C4D0" w:sz="4"/>
+              <w:left w:val="single" w:color="B8C4D0" w:sz="4"/>
+              <w:bottom w:val="single" w:color="B8C4D0" w:sz="4"/>
+              <w:right w:val="single" w:color="B8C4D0" w:sz="4"/>
+            </w:tcBorders>
+            <w:shd w:fill="0B3D6E" w:color="auto" w:val="clear"/>
+            <w:tcMar>
+              <w:top w:type="dxa" w:w="80"/>
+              <w:left w:type="dxa" w:w="100"/>
+              <w:bottom w:type="dxa" w:w="80"/>
+              <w:right w:type="dxa" w:w="100"/>
+            </w:tcMar>
+          </w:tcPr>
+          <w:p>
+            <w:r>
+              <w:rPr>
+                <w:b/>
+                <w:bCs/>
+                <w:color w:val="FFFFFF"/>
+                <w:sz w:val="20"/>
+                <w:szCs w:val="20"/>
+              </w:rPr>
+              <w:t xml:space="preserve">Ce que vous faites</w:t>
+            </w:r>
+          </w:p>
+        </w:tc>
+        <w:tc>
+          <w:tcPr>
+            <w:tcW w:type="dxa" w:w="2800"/>
+            <w:tcBorders>
+              <w:top w:val="single" w:color="B8C4D0" w:sz="4"/>
+              <w:left w:val="single" w:color="B8C4D0" w:sz="4"/>
+              <w:bottom w:val="single" w:color="B8C4D0" w:sz="4"/>
+              <w:right w:val="single" w:color="B8C4D0" w:sz="4"/>
+            </w:tcBorders>
+            <w:shd w:fill="0B3D6E" w:color="auto" w:val="clear"/>
+            <w:tcMar>
+              <w:top w:type="dxa" w:w="80"/>
+              <w:left w:type="dxa" w:w="100"/>
+              <w:bottom w:type="dxa" w:w="80"/>
+              <w:right w:type="dxa" w:w="100"/>
+            </w:tcMar>
+          </w:tcPr>
+          <w:p>
+            <w:r>
+              <w:rPr>
+                <w:b/>
+                <w:bCs/>
+                <w:color w:val="FFFFFF"/>
+                <w:sz w:val="20"/>
+                <w:szCs w:val="20"/>
+              </w:rPr>
+              <w:t xml:space="preserve">Ce que vous devez voir</w:t>
+            </w:r>
+          </w:p>
+        </w:tc>
+        <w:tc>
+          <w:tcPr>
+            <w:tcW w:type="dxa" w:w="1800"/>
+            <w:tcBorders>
+              <w:top w:val="single" w:color="B8C4D0" w:sz="4"/>
+              <w:left w:val="single" w:color="B8C4D0" w:sz="4"/>
+              <w:bottom w:val="single" w:color="B8C4D0" w:sz="4"/>
+              <w:right w:val="single" w:color="B8C4D0" w:sz="4"/>
+            </w:tcBorders>
+            <w:shd w:fill="0B3D6E" w:color="auto" w:val="clear"/>
+            <w:tcMar>
+              <w:top w:type="dxa" w:w="80"/>
+              <w:left w:type="dxa" w:w="100"/>
+              <w:bottom w:type="dxa" w:w="80"/>
+              <w:right w:type="dxa" w:w="100"/>
+            </w:tcMar>
+          </w:tcPr>
+          <w:p>
+            <w:r>
+              <w:rPr>
+                <w:b/>
+                <w:bCs/>
+                <w:color w:val="FFFFFF"/>
+                <w:sz w:val="20"/>
+                <w:szCs w:val="20"/>
+              </w:rPr>
+              <w:t xml:space="preserve">Résultat</w:t>
+            </w:r>
+          </w:p>
+        </w:tc>
+        <w:tc>
+          <w:tcPr>
+            <w:tcW w:type="dxa" w:w="1526"/>
+            <w:tcBorders>
+              <w:top w:val="single" w:color="B8C4D0" w:sz="4"/>
+              <w:left w:val="single" w:color="B8C4D0" w:sz="4"/>
+              <w:bottom w:val="single" w:color="B8C4D0" w:sz="4"/>
+              <w:right w:val="single" w:color="B8C4D0" w:sz="4"/>
+            </w:tcBorders>
+            <w:shd w:fill="0B3D6E" w:color="auto" w:val="clear"/>
+            <w:tcMar>
+              <w:top w:type="dxa" w:w="80"/>
+              <w:left w:type="dxa" w:w="100"/>
+              <w:bottom w:type="dxa" w:w="80"/>
+              <w:right w:type="dxa" w:w="100"/>
+            </w:tcMar>
+          </w:tcPr>
+          <w:p>
+            <w:r>
+              <w:rPr>
+                <w:b/>
+                <w:bCs/>
+                <w:color w:val="FFFFFF"/>
+                <w:sz w:val="20"/>
+                <w:szCs w:val="20"/>
+              </w:rPr>
+              <w:t xml:space="preserve">Commentaire</w:t>
+            </w:r>
+          </w:p>
+        </w:tc>
+      </w:tr>
+      <w:tr>
+        <w:trPr>
+          <w:cantSplit/>
+        </w:trPr>
+        <w:tc>
+          <w:tcPr>
+            <w:tcW w:type="dxa" w:w="480"/>
+            <w:tcBorders>
+              <w:top w:val="single" w:color="B8C4D0" w:sz="4"/>
+              <w:left w:val="single" w:color="B8C4D0" w:sz="4"/>
+              <w:bottom w:val="single" w:color="B8C4D0" w:sz="4"/>
+              <w:right w:val="single" w:color="B8C4D0" w:sz="4"/>
+            </w:tcBorders>
+            <w:shd w:fill="EAF1F8" w:color="auto" w:val="clear"/>
+            <w:tcMar>
+              <w:top w:type="dxa" w:w="80"/>
+              <w:left w:type="dxa" w:w="100"/>
+              <w:bottom w:type="dxa" w:w="80"/>
+              <w:right w:type="dxa" w:w="100"/>
+            </w:tcMar>
+          </w:tcPr>
+          <w:p>
+            <w:r>
+              <w:rPr>
+                <w:b w:val="false"/>
+                <w:bCs w:val="false"/>
+                <w:sz w:val="20"/>
+                <w:szCs w:val="20"/>
+              </w:rPr>
+              <w:t xml:space="preserve">1</w:t>
+            </w:r>
+          </w:p>
+        </w:tc>
+        <w:tc>
+          <w:tcPr>
+            <w:tcW w:type="dxa" w:w="3300"/>
+            <w:tcBorders>
+              <w:top w:val="single" w:color="B8C4D0" w:sz="4"/>
+              <w:left w:val="single" w:color="B8C4D0" w:sz="4"/>
+              <w:bottom w:val="single" w:color="B8C4D0" w:sz="4"/>
+              <w:right w:val="single" w:color="B8C4D0" w:sz="4"/>
+            </w:tcBorders>
+            <w:tcMar>
+              <w:top w:type="dxa" w:w="80"/>
+              <w:left w:type="dxa" w:w="100"/>
+              <w:bottom w:type="dxa" w:w="80"/>
+              <w:right w:type="dxa" w:w="100"/>
+            </w:tcMar>
+          </w:tcPr>
+          <w:p>
+            <w:r>
+              <w:rPr>
+                <w:b w:val="false"/>
+                <w:bCs w:val="false"/>
+                <w:sz w:val="20"/>
+                <w:szCs w:val="20"/>
+              </w:rPr>
+              <w:t xml:space="preserve">Ouvrez « Disponibilité de la plateforme » et choisissez une période.</w:t>
+            </w:r>
+          </w:p>
+        </w:tc>
+        <w:tc>
+          <w:tcPr>
+            <w:tcW w:type="dxa" w:w="2800"/>
+            <w:tcBorders>
+              <w:top w:val="single" w:color="B8C4D0" w:sz="4"/>
+              <w:left w:val="single" w:color="B8C4D0" w:sz="4"/>
+              <w:bottom w:val="single" w:color="B8C4D0" w:sz="4"/>
+              <w:right w:val="single" w:color="B8C4D0" w:sz="4"/>
+            </w:tcBorders>
+            <w:tcMar>
+              <w:top w:type="dxa" w:w="80"/>
+              <w:left w:type="dxa" w:w="100"/>
+              <w:bottom w:type="dxa" w:w="80"/>
+              <w:right w:type="dxa" w:w="100"/>
+            </w:tcMar>
+          </w:tcPr>
+          <w:p>
+            <w:r>
+              <w:rPr>
+                <w:b w:val="false"/>
+                <w:bCs w:val="false"/>
+                <w:sz w:val="20"/>
+                <w:szCs w:val="20"/>
+              </w:rPr>
+              <w:t xml:space="preserve">Deux taux : 24 h/24 et heures ouvrées, avec « Objectif atteint » ou « Sous l'objectif ».</w:t>
+            </w:r>
+          </w:p>
+        </w:tc>
+        <w:tc>
+          <w:tcPr>
+            <w:tcW w:type="dxa" w:w="1800"/>
+            <w:tcBorders>
+              <w:top w:val="single" w:color="B8C4D0" w:sz="4"/>
+              <w:left w:val="single" w:color="B8C4D0" w:sz="4"/>
+              <w:bottom w:val="single" w:color="B8C4D0" w:sz="4"/>
+              <w:right w:val="single" w:color="B8C4D0" w:sz="4"/>
+            </w:tcBorders>
+            <w:tcMar>
+              <w:top w:type="dxa" w:w="80"/>
+              <w:left w:type="dxa" w:w="100"/>
+              <w:bottom w:type="dxa" w:w="80"/>
+              <w:right w:type="dxa" w:w="100"/>
+            </w:tcMar>
+          </w:tcPr>
+          <w:p>
+            <w:r>
+              <w:rPr>
+                <w:b w:val="false"/>
+                <w:bCs w:val="false"/>
+                <w:sz w:val="20"/>
+                <w:szCs w:val="20"/>
+              </w:rPr>
+              <w:t xml:space="preserve">☐ Ça marche</w:t>
+            </w:r>
+          </w:p>
+          <w:p>
+            <w:r>
+              <w:rPr>
+                <w:b w:val="false"/>
+                <w:bCs w:val="false"/>
+                <w:sz w:val="20"/>
+                <w:szCs w:val="20"/>
+              </w:rPr>
+              <w:t xml:space="preserve">☐ Ne marche pas</w:t>
+            </w:r>
+          </w:p>
+          <w:p>
+            <w:r>
+              <w:rPr>
+                <w:b w:val="false"/>
+                <w:bCs w:val="false"/>
+                <w:sz w:val="20"/>
+                <w:szCs w:val="20"/>
+              </w:rPr>
+              <w:t xml:space="preserve">☐ Pas compris</w:t>
+            </w:r>
+          </w:p>
+        </w:tc>
+        <w:tc>
+          <w:tcPr>
+            <w:tcW w:type="dxa" w:w="1526"/>
+            <w:tcBorders>
+              <w:top w:val="single" w:color="B8C4D0" w:sz="4"/>
+              <w:left w:val="single" w:color="B8C4D0" w:sz="4"/>
+              <w:bottom w:val="single" w:color="B8C4D0" w:sz="4"/>
+              <w:right w:val="single" w:color="B8C4D0" w:sz="4"/>
+            </w:tcBorders>
+            <w:tcMar>
+              <w:top w:type="dxa" w:w="80"/>
+              <w:left w:type="dxa" w:w="100"/>
+              <w:bottom w:type="dxa" w:w="80"/>
+              <w:right w:type="dxa" w:w="100"/>
+            </w:tcMar>
+          </w:tcPr>
+          <w:p>
+            <w:r>
+              <w:rPr>
+                <w:b w:val="false"/>
+                <w:bCs w:val="false"/>
+                <w:sz w:val="20"/>
+                <w:szCs w:val="20"/>
+              </w:rPr>
+              <w:t xml:space="preserve"/>
+            </w:r>
+          </w:p>
+        </w:tc>
+      </w:tr>
+      <w:tr>
+        <w:trPr>
+          <w:cantSplit/>
+        </w:trPr>
+        <w:tc>
+          <w:tcPr>
+            <w:tcW w:type="dxa" w:w="480"/>
+            <w:tcBorders>
+              <w:top w:val="single" w:color="B8C4D0" w:sz="4"/>
+              <w:left w:val="single" w:color="B8C4D0" w:sz="4"/>
+              <w:bottom w:val="single" w:color="B8C4D0" w:sz="4"/>
+              <w:right w:val="single" w:color="B8C4D0" w:sz="4"/>
+            </w:tcBorders>
+            <w:shd w:fill="EAF1F8" w:color="auto" w:val="clear"/>
+            <w:tcMar>
+              <w:top w:type="dxa" w:w="80"/>
+              <w:left w:type="dxa" w:w="100"/>
+              <w:bottom w:type="dxa" w:w="80"/>
+              <w:right w:type="dxa" w:w="100"/>
+            </w:tcMar>
+          </w:tcPr>
+          <w:p>
+            <w:r>
+              <w:rPr>
+                <w:b w:val="false"/>
+                <w:bCs w:val="false"/>
+                <w:sz w:val="20"/>
+                <w:szCs w:val="20"/>
+              </w:rPr>
+              <w:t xml:space="preserve">2</w:t>
+            </w:r>
+          </w:p>
+        </w:tc>
+        <w:tc>
+          <w:tcPr>
+            <w:tcW w:type="dxa" w:w="3300"/>
+            <w:tcBorders>
+              <w:top w:val="single" w:color="B8C4D0" w:sz="4"/>
+              <w:left w:val="single" w:color="B8C4D0" w:sz="4"/>
+              <w:bottom w:val="single" w:color="B8C4D0" w:sz="4"/>
+              <w:right w:val="single" w:color="B8C4D0" w:sz="4"/>
+            </w:tcBorders>
+            <w:tcMar>
+              <w:top w:type="dxa" w:w="80"/>
+              <w:left w:type="dxa" w:w="100"/>
+              <w:bottom w:type="dxa" w:w="80"/>
+              <w:right w:type="dxa" w:w="100"/>
+            </w:tcMar>
+          </w:tcPr>
+          <w:p>
+            <w:r>
+              <w:rPr>
+                <w:b w:val="false"/>
+                <w:bCs w:val="false"/>
+                <w:sz w:val="20"/>
+                <w:szCs w:val="20"/>
+              </w:rPr>
+              <w:t xml:space="preserve">Avant une intervention, déclarez une maintenance : début, fin, motif, « Déclarer ».</w:t>
+            </w:r>
+          </w:p>
+        </w:tc>
+        <w:tc>
+          <w:tcPr>
+            <w:tcW w:type="dxa" w:w="2800"/>
+            <w:tcBorders>
+              <w:top w:val="single" w:color="B8C4D0" w:sz="4"/>
+              <w:left w:val="single" w:color="B8C4D0" w:sz="4"/>
+              <w:bottom w:val="single" w:color="B8C4D0" w:sz="4"/>
+              <w:right w:val="single" w:color="B8C4D0" w:sz="4"/>
+            </w:tcBorders>
+            <w:tcMar>
+              <w:top w:type="dxa" w:w="80"/>
+              <w:left w:type="dxa" w:w="100"/>
+              <w:bottom w:type="dxa" w:w="80"/>
+              <w:right w:type="dxa" w:w="100"/>
+            </w:tcMar>
+          </w:tcPr>
+          <w:p>
+            <w:r>
+              <w:rPr>
+                <w:b w:val="false"/>
+                <w:bCs w:val="false"/>
+                <w:sz w:val="20"/>
+                <w:szCs w:val="20"/>
+              </w:rPr>
+              <w:t xml:space="preserve">La maintenance est listée ; cette période ne comptera pas comme indisponibilité.</w:t>
+            </w:r>
+          </w:p>
+        </w:tc>
+        <w:tc>
+          <w:tcPr>
+            <w:tcW w:type="dxa" w:w="1800"/>
+            <w:tcBorders>
+              <w:top w:val="single" w:color="B8C4D0" w:sz="4"/>
+              <w:left w:val="single" w:color="B8C4D0" w:sz="4"/>
+              <w:bottom w:val="single" w:color="B8C4D0" w:sz="4"/>
+              <w:right w:val="single" w:color="B8C4D0" w:sz="4"/>
+            </w:tcBorders>
+            <w:tcMar>
+              <w:top w:type="dxa" w:w="80"/>
+              <w:left w:type="dxa" w:w="100"/>
+              <w:bottom w:type="dxa" w:w="80"/>
+              <w:right w:type="dxa" w:w="100"/>
+            </w:tcMar>
+          </w:tcPr>
+          <w:p>
+            <w:r>
+              <w:rPr>
+                <w:b w:val="false"/>
+                <w:bCs w:val="false"/>
+                <w:sz w:val="20"/>
+                <w:szCs w:val="20"/>
+              </w:rPr>
+              <w:t xml:space="preserve">☐ Ça marche</w:t>
+            </w:r>
+          </w:p>
+          <w:p>
+            <w:r>
+              <w:rPr>
+                <w:b w:val="false"/>
+                <w:bCs w:val="false"/>
+                <w:sz w:val="20"/>
+                <w:szCs w:val="20"/>
+              </w:rPr>
+              <w:t xml:space="preserve">☐ Ne marche pas</w:t>
+            </w:r>
+          </w:p>
+          <w:p>
+            <w:r>
+              <w:rPr>
+                <w:b w:val="false"/>
+                <w:bCs w:val="false"/>
+                <w:sz w:val="20"/>
+                <w:szCs w:val="20"/>
+              </w:rPr>
+              <w:t xml:space="preserve">☐ Pas compris</w:t>
+            </w:r>
+          </w:p>
+        </w:tc>
+        <w:tc>
+          <w:tcPr>
+            <w:tcW w:type="dxa" w:w="1526"/>
+            <w:tcBorders>
+              <w:top w:val="single" w:color="B8C4D0" w:sz="4"/>
+              <w:left w:val="single" w:color="B8C4D0" w:sz="4"/>
+              <w:bottom w:val="single" w:color="B8C4D0" w:sz="4"/>
+              <w:right w:val="single" w:color="B8C4D0" w:sz="4"/>
+            </w:tcBorders>
+            <w:tcMar>
+              <w:top w:type="dxa" w:w="80"/>
+              <w:left w:type="dxa" w:w="100"/>
+              <w:bottom w:type="dxa" w:w="80"/>
+              <w:right w:type="dxa" w:w="100"/>
+            </w:tcMar>
+          </w:tcPr>
+          <w:p>
+            <w:r>
+              <w:rPr>
+                <w:b w:val="false"/>
+                <w:bCs w:val="false"/>
+                <w:sz w:val="20"/>
+                <w:szCs w:val="20"/>
+              </w:rPr>
+              <w:t xml:space="preserve"/>
+            </w:r>
+          </w:p>
+        </w:tc>
+      </w:tr>
+      <w:tr>
+        <w:trPr>
+          <w:cantSplit/>
+        </w:trPr>
+        <w:tc>
+          <w:tcPr>
+            <w:tcW w:type="dxa" w:w="480"/>
+            <w:tcBorders>
+              <w:top w:val="single" w:color="B8C4D0" w:sz="4"/>
+              <w:left w:val="single" w:color="B8C4D0" w:sz="4"/>
+              <w:bottom w:val="single" w:color="B8C4D0" w:sz="4"/>
+              <w:right w:val="single" w:color="B8C4D0" w:sz="4"/>
+            </w:tcBorders>
+            <w:shd w:fill="EAF1F8" w:color="auto" w:val="clear"/>
+            <w:tcMar>
+              <w:top w:type="dxa" w:w="80"/>
+              <w:left w:type="dxa" w:w="100"/>
+              <w:bottom w:type="dxa" w:w="80"/>
+              <w:right w:type="dxa" w:w="100"/>
+            </w:tcMar>
+          </w:tcPr>
+          <w:p>
+            <w:r>
+              <w:rPr>
+                <w:b w:val="false"/>
+                <w:bCs w:val="false"/>
+                <w:sz w:val="20"/>
+                <w:szCs w:val="20"/>
+              </w:rPr>
+              <w:t xml:space="preserve">3</w:t>
+            </w:r>
+          </w:p>
+        </w:tc>
+        <w:tc>
+          <w:tcPr>
+            <w:tcW w:type="dxa" w:w="3300"/>
+            <w:tcBorders>
+              <w:top w:val="single" w:color="B8C4D0" w:sz="4"/>
+              <w:left w:val="single" w:color="B8C4D0" w:sz="4"/>
+              <w:bottom w:val="single" w:color="B8C4D0" w:sz="4"/>
+              <w:right w:val="single" w:color="B8C4D0" w:sz="4"/>
+            </w:tcBorders>
+            <w:tcMar>
+              <w:top w:type="dxa" w:w="80"/>
+              <w:left w:type="dxa" w:w="100"/>
+              <w:bottom w:type="dxa" w:w="80"/>
+              <w:right w:type="dxa" w:w="100"/>
+            </w:tcMar>
+          </w:tcPr>
+          <w:p>
+            <w:r>
+              <w:rPr>
+                <w:b w:val="false"/>
+                <w:bCs w:val="false"/>
+                <w:sz w:val="20"/>
+                <w:szCs w:val="20"/>
+              </w:rPr>
+              <w:t xml:space="preserve">Annulez la maintenance de test.</w:t>
+            </w:r>
+          </w:p>
+        </w:tc>
+        <w:tc>
+          <w:tcPr>
+            <w:tcW w:type="dxa" w:w="2800"/>
+            <w:tcBorders>
+              <w:top w:val="single" w:color="B8C4D0" w:sz="4"/>
+              <w:left w:val="single" w:color="B8C4D0" w:sz="4"/>
+              <w:bottom w:val="single" w:color="B8C4D0" w:sz="4"/>
+              <w:right w:val="single" w:color="B8C4D0" w:sz="4"/>
+            </w:tcBorders>
+            <w:tcMar>
+              <w:top w:type="dxa" w:w="80"/>
+              <w:left w:type="dxa" w:w="100"/>
+              <w:bottom w:type="dxa" w:w="80"/>
+              <w:right w:type="dxa" w:w="100"/>
+            </w:tcMar>
+          </w:tcPr>
+          <w:p>
+            <w:r>
+              <w:rPr>
+                <w:b w:val="false"/>
+                <w:bCs w:val="false"/>
+                <w:sz w:val="20"/>
+                <w:szCs w:val="20"/>
+              </w:rPr>
+              <w:t xml:space="preserve">Elle disparaît de la liste ; déclaration et annulation sont tracées dans l'audit.</w:t>
+            </w:r>
+          </w:p>
+        </w:tc>
+        <w:tc>
+          <w:tcPr>
+            <w:tcW w:type="dxa" w:w="1800"/>
+            <w:tcBorders>
+              <w:top w:val="single" w:color="B8C4D0" w:sz="4"/>
+              <w:left w:val="single" w:color="B8C4D0" w:sz="4"/>
+              <w:bottom w:val="single" w:color="B8C4D0" w:sz="4"/>
+              <w:right w:val="single" w:color="B8C4D0" w:sz="4"/>
+            </w:tcBorders>
+            <w:tcMar>
+              <w:top w:type="dxa" w:w="80"/>
+              <w:left w:type="dxa" w:w="100"/>
+              <w:bottom w:type="dxa" w:w="80"/>
+              <w:right w:type="dxa" w:w="100"/>
+            </w:tcMar>
+          </w:tcPr>
+          <w:p>
+            <w:r>
+              <w:rPr>
+                <w:b w:val="false"/>
+                <w:bCs w:val="false"/>
+                <w:sz w:val="20"/>
+                <w:szCs w:val="20"/>
+              </w:rPr>
+              <w:t xml:space="preserve">☐ Ça marche</w:t>
+            </w:r>
+          </w:p>
+          <w:p>
+            <w:r>
+              <w:rPr>
+                <w:b w:val="false"/>
+                <w:bCs w:val="false"/>
+                <w:sz w:val="20"/>
+                <w:szCs w:val="20"/>
+              </w:rPr>
+              <w:t xml:space="preserve">☐ Ne marche pas</w:t>
+            </w:r>
+          </w:p>
+          <w:p>
+            <w:r>
+              <w:rPr>
+                <w:b w:val="false"/>
+                <w:bCs w:val="false"/>
+                <w:sz w:val="20"/>
+                <w:szCs w:val="20"/>
+              </w:rPr>
+              <w:t xml:space="preserve">☐ Pas compris</w:t>
+            </w:r>
+          </w:p>
+        </w:tc>
+        <w:tc>
+          <w:tcPr>
+            <w:tcW w:type="dxa" w:w="1526"/>
+            <w:tcBorders>
+              <w:top w:val="single" w:color="B8C4D0" w:sz="4"/>
+              <w:left w:val="single" w:color="B8C4D0" w:sz="4"/>
+              <w:bottom w:val="single" w:color="B8C4D0" w:sz="4"/>
+              <w:right w:val="single" w:color="B8C4D0" w:sz="4"/>
+            </w:tcBorders>
+            <w:tcMar>
+              <w:top w:type="dxa" w:w="80"/>
+              <w:left w:type="dxa" w:w="100"/>
+              <w:bottom w:type="dxa" w:w="80"/>
+              <w:right w:type="dxa" w:w="100"/>
+            </w:tcMar>
+          </w:tcPr>
+          <w:p>
+            <w:r>
+              <w:rPr>
+                <w:b w:val="false"/>
+                <w:bCs w:val="false"/>
+                <w:sz w:val="20"/>
+                <w:szCs w:val="20"/>
+              </w:rPr>
+              <w:t xml:space="preserve"/>
+            </w:r>
+          </w:p>
+        </w:tc>
+      </w:tr>
+    </w:tbl>
+    <w:p>
+      <w:pPr>
+        <w:spacing w:after="120"/>
+      </w:pPr>
+      <w:r>
+        <w:t xml:space="preserve"/>
+      </w:r>
+    </w:p>
+    <w:p>
+      <w:pPr>
+        <w:pStyle w:val="Heading1"/>
+      </w:pPr>
+      <w:r>
+        <w:t xml:space="preserve">Partie 14 — Terminer</w:t>
       </w:r>
     </w:p>
     <w:p>

</xml_diff>